<commit_message>
Day 15: deepen Materi to the plan's Wissen (rule 2.17) with real findings
All 13 Wissen topics are now full: fixations and the eye-mind assumption, sample-size advice, the
ADHD neurofeedback meta-analysis, the BCI definition, EU AI Act Article 5(1)(f), the ICO
neurotechnology report and neurorights. Day 15 added to verify:depth; Word documents of Day 15
rebuilt.

Co-Authored-By: Claude Sonnet 5.5 <noreply@anthropic.com>
</commit_message>
<xml_diff>
--- a/docx/Day15-Materi-AION-UX-Developer-Eye-tracking-and-gaze-behaviour-neurofeedback-and-brain.docx
+++ b/docx/Day15-Materi-AION-UX-Developer-Eye-tracking-and-gaze-behaviour-neurofeedback-and-brain.docx
@@ -2830,6 +2830,319 @@
         <w:spacing w:before="0" w:after="80"/>
       </w:pPr>
     </w:p>
+    <w:p>
+      <w:pPr>
+        <w:spacing w:before="0" w:after="100"/>
+      </w:pPr>
+      <w:r>
+        <w:rPr>
+          <w:b/>
+        </w:rPr>
+        <w:t>What eye-tracking measures: basis and sample sizes</w:t>
+      </w:r>
+    </w:p>
+    <w:tbl>
+      <w:tblPr>
+        <w:tblW w:w="9638" w:type="dxa"/>
+        <w:tblBorders>
+          <w:top w:val="single" w:sz="4" w:space="0" w:color="D5DEE9"/>
+          <w:left w:val="single" w:sz="4" w:space="0" w:color="D5DEE9"/>
+          <w:bottom w:val="single" w:sz="4" w:space="0" w:color="D5DEE9"/>
+          <w:right w:val="single" w:sz="4" w:space="0" w:color="D5DEE9"/>
+          <w:insideH w:val="single" w:sz="4" w:space="0" w:color="D5DEE9"/>
+          <w:insideV w:val="single" w:sz="4" w:space="0" w:color="D5DEE9"/>
+        </w:tblBorders>
+        <w:tblLayout w:type="fixed"/>
+        <w:tblCellMar>
+          <w:top w:w="60" w:type="dxa"/>
+          <w:left w:w="100" w:type="dxa"/>
+          <w:bottom w:w="60" w:type="dxa"/>
+          <w:right w:w="100" w:type="dxa"/>
+        </w:tblCellMar>
+      </w:tblPr>
+      <w:tblGrid>
+        <w:gridCol w:w="1811"/>
+        <w:gridCol w:w="4921"/>
+        <w:gridCol w:w="2906"/>
+      </w:tblGrid>
+      <w:tr>
+        <w:trPr>
+          <w:cantSplit/>
+          <w:tblHeader/>
+        </w:trPr>
+        <w:tc>
+          <w:tcPr>
+            <w:tcW w:type="dxa" w:w="1811"/>
+            <w:shd w:val="clear" w:color="auto" w:fill="E6ECF4"/>
+          </w:tcPr>
+          <w:p>
+            <w:pPr>
+              <w:spacing w:before="0" w:after="0"/>
+            </w:pPr>
+            <w:r>
+              <w:rPr>
+                <w:b/>
+                <w:sz w:val="20"/>
+              </w:rPr>
+              <w:t>Topic</w:t>
+            </w:r>
+          </w:p>
+        </w:tc>
+        <w:tc>
+          <w:tcPr>
+            <w:tcW w:type="dxa" w:w="4921"/>
+            <w:shd w:val="clear" w:color="auto" w:fill="E6ECF4"/>
+          </w:tcPr>
+          <w:p>
+            <w:pPr>
+              <w:spacing w:before="0" w:after="0"/>
+            </w:pPr>
+            <w:r>
+              <w:rPr>
+                <w:b/>
+                <w:sz w:val="20"/>
+              </w:rPr>
+              <w:t>Real finding</w:t>
+            </w:r>
+          </w:p>
+        </w:tc>
+        <w:tc>
+          <w:tcPr>
+            <w:tcW w:type="dxa" w:w="2906"/>
+            <w:shd w:val="clear" w:color="auto" w:fill="E6ECF4"/>
+          </w:tcPr>
+          <w:p>
+            <w:pPr>
+              <w:spacing w:before="0" w:after="0"/>
+            </w:pPr>
+            <w:r>
+              <w:rPr>
+                <w:b/>
+                <w:sz w:val="20"/>
+              </w:rPr>
+              <w:t>What it means for a study</w:t>
+            </w:r>
+          </w:p>
+        </w:tc>
+      </w:tr>
+      <w:tr>
+        <w:trPr>
+          <w:cantSplit/>
+        </w:trPr>
+        <w:tc>
+          <w:tcPr>
+            <w:tcW w:type="dxa" w:w="1811"/>
+          </w:tcPr>
+          <w:p>
+            <w:pPr>
+              <w:spacing w:before="0" w:after="0"/>
+            </w:pPr>
+            <w:r>
+              <w:rPr>
+                <w:sz w:val="20"/>
+              </w:rPr>
+              <w:t>Fixations</w:t>
+            </w:r>
+          </w:p>
+        </w:tc>
+        <w:tc>
+          <w:tcPr>
+            <w:tcW w:type="dxa" w:w="4921"/>
+          </w:tcPr>
+          <w:p>
+            <w:pPr>
+              <w:spacing w:before="0" w:after="0"/>
+            </w:pPr>
+            <w:r>
+              <w:rPr>
+                <w:sz w:val="20"/>
+              </w:rPr>
+              <w:t>The eyes rest for about 200 to 300 ms in a fixation and take in information only while they rest (Rayner 1998; Holmqvist et al. 2011).</w:t>
+            </w:r>
+          </w:p>
+        </w:tc>
+        <w:tc>
+          <w:tcPr>
+            <w:tcW w:type="dxa" w:w="2906"/>
+          </w:tcPr>
+          <w:p>
+            <w:pPr>
+              <w:spacing w:before="0" w:after="0"/>
+            </w:pPr>
+            <w:r>
+              <w:rPr>
+                <w:sz w:val="20"/>
+              </w:rPr>
+              <w:t>Dwell time on a line is evidence of effort or interest, not yet of the reason.</w:t>
+            </w:r>
+          </w:p>
+        </w:tc>
+      </w:tr>
+      <w:tr>
+        <w:trPr>
+          <w:cantSplit/>
+        </w:trPr>
+        <w:tc>
+          <w:tcPr>
+            <w:tcW w:type="dxa" w:w="1811"/>
+          </w:tcPr>
+          <w:p>
+            <w:pPr>
+              <w:spacing w:before="0" w:after="0"/>
+            </w:pPr>
+            <w:r>
+              <w:rPr>
+                <w:sz w:val="20"/>
+              </w:rPr>
+              <w:t>The eye–mind assumption</w:t>
+            </w:r>
+          </w:p>
+        </w:tc>
+        <w:tc>
+          <w:tcPr>
+            <w:tcW w:type="dxa" w:w="4921"/>
+          </w:tcPr>
+          <w:p>
+            <w:pPr>
+              <w:spacing w:before="0" w:after="0"/>
+            </w:pPr>
+            <w:r>
+              <w:rPr>
+                <w:sz w:val="20"/>
+              </w:rPr>
+              <w:t>Just and Carpenter proposed that the eye stays on a word as long as it is being processed, which is why gaze can serve as a trace of processing (Just and Carpenter 1980).</w:t>
+            </w:r>
+          </w:p>
+        </w:tc>
+        <w:tc>
+          <w:tcPr>
+            <w:tcW w:type="dxa" w:w="2906"/>
+          </w:tcPr>
+          <w:p>
+            <w:pPr>
+              <w:spacing w:before="0" w:after="0"/>
+            </w:pPr>
+            <w:r>
+              <w:rPr>
+                <w:sz w:val="20"/>
+              </w:rPr>
+              <w:t>The assumption holds best for reading; for free viewing and for interfaces it is weaker.</w:t>
+            </w:r>
+          </w:p>
+        </w:tc>
+      </w:tr>
+      <w:tr>
+        <w:trPr>
+          <w:cantSplit/>
+        </w:trPr>
+        <w:tc>
+          <w:tcPr>
+            <w:tcW w:type="dxa" w:w="1811"/>
+          </w:tcPr>
+          <w:p>
+            <w:pPr>
+              <w:spacing w:before="0" w:after="0"/>
+            </w:pPr>
+            <w:r>
+              <w:rPr>
+                <w:sz w:val="20"/>
+              </w:rPr>
+              <w:t>How many participants</w:t>
+            </w:r>
+          </w:p>
+        </w:tc>
+        <w:tc>
+          <w:tcPr>
+            <w:tcW w:type="dxa" w:w="4921"/>
+          </w:tcPr>
+          <w:p>
+            <w:pPr>
+              <w:spacing w:before="0" w:after="0"/>
+            </w:pPr>
+            <w:r>
+              <w:rPr>
+                <w:sz w:val="20"/>
+              </w:rPr>
+              <w:t>Nielsen's 2009 eye-tracking report advised about 39 participants for stable heatmaps, against about five for a qualitative test; a 2025 paper finds no single sample size and gives examples from about 10 to 44 depending on the measure and the precision (Nielsen 2009; Behavior Research Methods 2025; as reported).</w:t>
+            </w:r>
+          </w:p>
+        </w:tc>
+        <w:tc>
+          <w:tcPr>
+            <w:tcW w:type="dxa" w:w="2906"/>
+          </w:tcPr>
+          <w:p>
+            <w:pPr>
+              <w:spacing w:before="0" w:after="0"/>
+            </w:pPr>
+            <w:r>
+              <w:rPr>
+                <w:sz w:val="20"/>
+              </w:rPr>
+              <w:t>Decide the sample size from the question: a heatmap needs far more people than a qualitative look.</w:t>
+            </w:r>
+          </w:p>
+        </w:tc>
+      </w:tr>
+      <w:tr>
+        <w:trPr>
+          <w:cantSplit/>
+        </w:trPr>
+        <w:tc>
+          <w:tcPr>
+            <w:tcW w:type="dxa" w:w="1811"/>
+          </w:tcPr>
+          <w:p>
+            <w:pPr>
+              <w:spacing w:before="0" w:after="0"/>
+            </w:pPr>
+            <w:r>
+              <w:rPr>
+                <w:sz w:val="20"/>
+              </w:rPr>
+              <w:t>Methods</w:t>
+            </w:r>
+          </w:p>
+        </w:tc>
+        <w:tc>
+          <w:tcPr>
+            <w:tcW w:type="dxa" w:w="4921"/>
+          </w:tcPr>
+          <w:p>
+            <w:pPr>
+              <w:spacing w:before="0" w:after="0"/>
+            </w:pPr>
+            <w:r>
+              <w:rPr>
+                <w:sz w:val="20"/>
+              </w:rPr>
+              <w:t>Handbooks cover recording, calibration, areas of interest and the main measures (Holmqvist et al. 2011; Duchowski 2017).</w:t>
+            </w:r>
+          </w:p>
+        </w:tc>
+        <w:tc>
+          <w:tcPr>
+            <w:tcW w:type="dxa" w:w="2906"/>
+          </w:tcPr>
+          <w:p>
+            <w:pPr>
+              <w:spacing w:before="0" w:after="0"/>
+            </w:pPr>
+            <w:r>
+              <w:rPr>
+                <w:sz w:val="20"/>
+              </w:rPr>
+              <w:t>Define the areas of interest before the study, not after.</w:t>
+            </w:r>
+          </w:p>
+        </w:tc>
+      </w:tr>
+    </w:tbl>
+    <w:p>
+      <w:pPr>
+        <w:spacing w:before="0" w:after="80"/>
+      </w:pPr>
+    </w:p>
     <w:tbl>
       <w:tblPr>
         <w:tblW w:w="9598" w:type="dxa"/>
@@ -2879,7 +3192,7 @@
             </w:pPr>
             <w:r>
               <w:rPr/>
-              <w:t>Tessel, Mara, Joon, Ines and Bastian are made up for this example; the gaze recordings are drawn for the lesson, not measured. The measures follow Holmqvist et al. (2011); how trackers work follows Duchowski (2017).</w:t>
+              <w:t>Tessel, Mara, Joon, Ines and Bastian are made up for this example; the gaze recordings are drawn for the lesson, not measured. The measures follow Holmqvist et al. (2011); how trackers work follows Duchowski (2017). The findings in the table of real evidence are real research results, rules and cases; the sources are listed below.</w:t>
             </w:r>
           </w:p>
         </w:tc>
@@ -3068,7 +3381,7 @@
           <w:color w:val="556274"/>
           <w:sz w:val="18"/>
         </w:rPr>
-        <w:t>Holmqvist et al. 2011 · Duchowski 2017</w:t>
+        <w:t>Holmqvist et al. 2011 · Duchowski 2017 · Rayner 1998 · Nielsen 2009 · Behavior Research Methods 2025</w:t>
       </w:r>
     </w:p>
     <w:p>
@@ -3303,6 +3616,266 @@
         <w:t>Figure 3 · The interpretation ladder: from seen to agreed, and what each step needs.</w:t>
       </w:r>
     </w:p>
+    <w:p>
+      <w:pPr>
+        <w:spacing w:before="0" w:after="100"/>
+      </w:pPr>
+      <w:r>
+        <w:rPr>
+          <w:b/>
+        </w:rPr>
+        <w:t>Looking is not understanding: the limits</w:t>
+      </w:r>
+    </w:p>
+    <w:tbl>
+      <w:tblPr>
+        <w:tblW w:w="9638" w:type="dxa"/>
+        <w:tblBorders>
+          <w:top w:val="single" w:sz="4" w:space="0" w:color="D5DEE9"/>
+          <w:left w:val="single" w:sz="4" w:space="0" w:color="D5DEE9"/>
+          <w:bottom w:val="single" w:sz="4" w:space="0" w:color="D5DEE9"/>
+          <w:right w:val="single" w:sz="4" w:space="0" w:color="D5DEE9"/>
+          <w:insideH w:val="single" w:sz="4" w:space="0" w:color="D5DEE9"/>
+          <w:insideV w:val="single" w:sz="4" w:space="0" w:color="D5DEE9"/>
+        </w:tblBorders>
+        <w:tblLayout w:type="fixed"/>
+        <w:tblCellMar>
+          <w:top w:w="60" w:type="dxa"/>
+          <w:left w:w="100" w:type="dxa"/>
+          <w:bottom w:w="60" w:type="dxa"/>
+          <w:right w:w="100" w:type="dxa"/>
+        </w:tblCellMar>
+      </w:tblPr>
+      <w:tblGrid>
+        <w:gridCol w:w="2248"/>
+        <w:gridCol w:w="4364"/>
+        <w:gridCol w:w="3026"/>
+      </w:tblGrid>
+      <w:tr>
+        <w:trPr>
+          <w:cantSplit/>
+          <w:tblHeader/>
+        </w:trPr>
+        <w:tc>
+          <w:tcPr>
+            <w:tcW w:type="dxa" w:w="2248"/>
+            <w:shd w:val="clear" w:color="auto" w:fill="E6ECF4"/>
+          </w:tcPr>
+          <w:p>
+            <w:pPr>
+              <w:spacing w:before="0" w:after="0"/>
+            </w:pPr>
+            <w:r>
+              <w:rPr>
+                <w:b/>
+                <w:sz w:val="20"/>
+              </w:rPr>
+              <w:t>Limit</w:t>
+            </w:r>
+          </w:p>
+        </w:tc>
+        <w:tc>
+          <w:tcPr>
+            <w:tcW w:type="dxa" w:w="4364"/>
+            <w:shd w:val="clear" w:color="auto" w:fill="E6ECF4"/>
+          </w:tcPr>
+          <w:p>
+            <w:pPr>
+              <w:spacing w:before="0" w:after="0"/>
+            </w:pPr>
+            <w:r>
+              <w:rPr>
+                <w:b/>
+                <w:sz w:val="20"/>
+              </w:rPr>
+              <w:t>What it means</w:t>
+            </w:r>
+          </w:p>
+        </w:tc>
+        <w:tc>
+          <w:tcPr>
+            <w:tcW w:type="dxa" w:w="3026"/>
+            <w:shd w:val="clear" w:color="auto" w:fill="E6ECF4"/>
+          </w:tcPr>
+          <w:p>
+            <w:pPr>
+              <w:spacing w:before="0" w:after="0"/>
+            </w:pPr>
+            <w:r>
+              <w:rPr>
+                <w:b/>
+                <w:sz w:val="20"/>
+              </w:rPr>
+              <w:t>What to do in a study</w:t>
+            </w:r>
+          </w:p>
+        </w:tc>
+      </w:tr>
+      <w:tr>
+        <w:trPr>
+          <w:cantSplit/>
+        </w:trPr>
+        <w:tc>
+          <w:tcPr>
+            <w:tcW w:type="dxa" w:w="2248"/>
+          </w:tcPr>
+          <w:p>
+            <w:pPr>
+              <w:spacing w:before="0" w:after="0"/>
+            </w:pPr>
+            <w:r>
+              <w:rPr>
+                <w:sz w:val="20"/>
+              </w:rPr>
+              <w:t>Looking without seeing</w:t>
+            </w:r>
+          </w:p>
+        </w:tc>
+        <w:tc>
+          <w:tcPr>
+            <w:tcW w:type="dxa" w:w="4364"/>
+          </w:tcPr>
+          <w:p>
+            <w:pPr>
+              <w:spacing w:before="0" w:after="0"/>
+            </w:pPr>
+            <w:r>
+              <w:rPr>
+                <w:sz w:val="20"/>
+              </w:rPr>
+              <w:t>Attention can be directed to a place without moving the eyes, and a fixation can fall on something that is not processed (Holmqvist et al. 2011).</w:t>
+            </w:r>
+          </w:p>
+        </w:tc>
+        <w:tc>
+          <w:tcPr>
+            <w:tcW w:type="dxa" w:w="3026"/>
+          </w:tcPr>
+          <w:p>
+            <w:pPr>
+              <w:spacing w:before="0" w:after="0"/>
+            </w:pPr>
+            <w:r>
+              <w:rPr>
+                <w:sz w:val="20"/>
+              </w:rPr>
+              <w:t>Never read a fixation as proof that the content was understood.</w:t>
+            </w:r>
+          </w:p>
+        </w:tc>
+      </w:tr>
+      <w:tr>
+        <w:trPr>
+          <w:cantSplit/>
+        </w:trPr>
+        <w:tc>
+          <w:tcPr>
+            <w:tcW w:type="dxa" w:w="2248"/>
+          </w:tcPr>
+          <w:p>
+            <w:pPr>
+              <w:spacing w:before="0" w:after="0"/>
+            </w:pPr>
+            <w:r>
+              <w:rPr>
+                <w:sz w:val="20"/>
+              </w:rPr>
+              <w:t>Attention without agreement</w:t>
+            </w:r>
+          </w:p>
+        </w:tc>
+        <w:tc>
+          <w:tcPr>
+            <w:tcW w:type="dxa" w:w="4364"/>
+          </w:tcPr>
+          <w:p>
+            <w:pPr>
+              <w:spacing w:before="0" w:after="0"/>
+            </w:pPr>
+            <w:r>
+              <w:rPr>
+                <w:sz w:val="20"/>
+              </w:rPr>
+              <w:t>A long fixation can mean interest, confusion or disapproval; the gaze data does not say which (Holmqvist et al. 2011).</w:t>
+            </w:r>
+          </w:p>
+        </w:tc>
+        <w:tc>
+          <w:tcPr>
+            <w:tcW w:type="dxa" w:w="3026"/>
+          </w:tcPr>
+          <w:p>
+            <w:pPr>
+              <w:spacing w:before="0" w:after="0"/>
+            </w:pPr>
+            <w:r>
+              <w:rPr>
+                <w:sz w:val="20"/>
+              </w:rPr>
+              <w:t>Add a question or a think-aloud to every gaze finding.</w:t>
+            </w:r>
+          </w:p>
+        </w:tc>
+      </w:tr>
+      <w:tr>
+        <w:trPr>
+          <w:cantSplit/>
+        </w:trPr>
+        <w:tc>
+          <w:tcPr>
+            <w:tcW w:type="dxa" w:w="2248"/>
+          </w:tcPr>
+          <w:p>
+            <w:pPr>
+              <w:spacing w:before="0" w:after="0"/>
+            </w:pPr>
+            <w:r>
+              <w:rPr>
+                <w:sz w:val="20"/>
+              </w:rPr>
+              <w:t>Interpretation</w:t>
+            </w:r>
+          </w:p>
+        </w:tc>
+        <w:tc>
+          <w:tcPr>
+            <w:tcW w:type="dxa" w:w="4364"/>
+          </w:tcPr>
+          <w:p>
+            <w:pPr>
+              <w:spacing w:before="0" w:after="0"/>
+            </w:pPr>
+            <w:r>
+              <w:rPr>
+                <w:sz w:val="20"/>
+              </w:rPr>
+              <w:t>The eye–mind assumption gives a plausible reading, not a measured one (Just and Carpenter 1980).</w:t>
+            </w:r>
+          </w:p>
+        </w:tc>
+        <w:tc>
+          <w:tcPr>
+            <w:tcW w:type="dxa" w:w="3026"/>
+          </w:tcPr>
+          <w:p>
+            <w:pPr>
+              <w:spacing w:before="0" w:after="0"/>
+            </w:pPr>
+            <w:r>
+              <w:rPr>
+                <w:sz w:val="20"/>
+              </w:rPr>
+              <w:t>Write each finding as a step on a ladder: recorded, interpreted, tested.</w:t>
+            </w:r>
+          </w:p>
+        </w:tc>
+      </w:tr>
+    </w:tbl>
+    <w:p>
+      <w:pPr>
+        <w:spacing w:before="0" w:after="80"/>
+      </w:pPr>
+    </w:p>
     <w:tbl>
       <w:tblPr>
         <w:tblW w:w="9598" w:type="dxa"/>
@@ -3352,7 +3925,7 @@
             </w:pPr>
             <w:r>
               <w:rPr/>
-              <w:t>Tessel, Mara, Joon, Ines and Bastian are made up for this example; the gaze recordings are drawn for the lesson, not measured. The working assumption that what is fixated is being processed, and that longer fixations can mean more effort, follows Just and Carpenter (1980).</w:t>
+              <w:t>Tessel, Mara, Joon, Ines and Bastian are made up for this example; the gaze recordings are drawn for the lesson, not measured. The working assumption that what is fixated is being processed, and that longer fixations can mean more effort, follows Just and Carpenter (1980). The findings in the table of real evidence are real research results, rules and cases; the sources are listed below.</w:t>
             </w:r>
           </w:p>
         </w:tc>
@@ -4117,6 +4690,266 @@
         <w:spacing w:before="0" w:after="80"/>
       </w:pPr>
     </w:p>
+    <w:p>
+      <w:pPr>
+        <w:spacing w:before="0" w:after="100"/>
+      </w:pPr>
+      <w:r>
+        <w:rPr>
+          <w:b/>
+        </w:rPr>
+        <w:t>Neurofeedback and brain-computer interfaces: real maturity</w:t>
+      </w:r>
+    </w:p>
+    <w:tbl>
+      <w:tblPr>
+        <w:tblW w:w="9638" w:type="dxa"/>
+        <w:tblBorders>
+          <w:top w:val="single" w:sz="4" w:space="0" w:color="D5DEE9"/>
+          <w:left w:val="single" w:sz="4" w:space="0" w:color="D5DEE9"/>
+          <w:bottom w:val="single" w:sz="4" w:space="0" w:color="D5DEE9"/>
+          <w:right w:val="single" w:sz="4" w:space="0" w:color="D5DEE9"/>
+          <w:insideH w:val="single" w:sz="4" w:space="0" w:color="D5DEE9"/>
+          <w:insideV w:val="single" w:sz="4" w:space="0" w:color="D5DEE9"/>
+        </w:tblBorders>
+        <w:tblLayout w:type="fixed"/>
+        <w:tblCellMar>
+          <w:top w:w="60" w:type="dxa"/>
+          <w:left w:w="100" w:type="dxa"/>
+          <w:bottom w:w="60" w:type="dxa"/>
+          <w:right w:w="100" w:type="dxa"/>
+        </w:tblCellMar>
+      </w:tblPr>
+      <w:tblGrid>
+        <w:gridCol w:w="2024"/>
+        <w:gridCol w:w="4822"/>
+        <w:gridCol w:w="2792"/>
+      </w:tblGrid>
+      <w:tr>
+        <w:trPr>
+          <w:cantSplit/>
+          <w:tblHeader/>
+        </w:trPr>
+        <w:tc>
+          <w:tcPr>
+            <w:tcW w:type="dxa" w:w="2024"/>
+            <w:shd w:val="clear" w:color="auto" w:fill="E6ECF4"/>
+          </w:tcPr>
+          <w:p>
+            <w:pPr>
+              <w:spacing w:before="0" w:after="0"/>
+            </w:pPr>
+            <w:r>
+              <w:rPr>
+                <w:b/>
+                <w:sz w:val="20"/>
+              </w:rPr>
+              <w:t>Topic</w:t>
+            </w:r>
+          </w:p>
+        </w:tc>
+        <w:tc>
+          <w:tcPr>
+            <w:tcW w:type="dxa" w:w="4822"/>
+            <w:shd w:val="clear" w:color="auto" w:fill="E6ECF4"/>
+          </w:tcPr>
+          <w:p>
+            <w:pPr>
+              <w:spacing w:before="0" w:after="0"/>
+            </w:pPr>
+            <w:r>
+              <w:rPr>
+                <w:b/>
+                <w:sz w:val="20"/>
+              </w:rPr>
+              <w:t>Real finding</w:t>
+            </w:r>
+          </w:p>
+        </w:tc>
+        <w:tc>
+          <w:tcPr>
+            <w:tcW w:type="dxa" w:w="2792"/>
+            <w:shd w:val="clear" w:color="auto" w:fill="E6ECF4"/>
+          </w:tcPr>
+          <w:p>
+            <w:pPr>
+              <w:spacing w:before="0" w:after="0"/>
+            </w:pPr>
+            <w:r>
+              <w:rPr>
+                <w:b/>
+                <w:sz w:val="20"/>
+              </w:rPr>
+              <w:t>What it means for a product</w:t>
+            </w:r>
+          </w:p>
+        </w:tc>
+      </w:tr>
+      <w:tr>
+        <w:trPr>
+          <w:cantSplit/>
+        </w:trPr>
+        <w:tc>
+          <w:tcPr>
+            <w:tcW w:type="dxa" w:w="2024"/>
+          </w:tcPr>
+          <w:p>
+            <w:pPr>
+              <w:spacing w:before="0" w:after="0"/>
+            </w:pPr>
+            <w:r>
+              <w:rPr>
+                <w:sz w:val="20"/>
+              </w:rPr>
+              <w:t>Brain-computer interfaces</w:t>
+            </w:r>
+          </w:p>
+        </w:tc>
+        <w:tc>
+          <w:tcPr>
+            <w:tcW w:type="dxa" w:w="4822"/>
+          </w:tcPr>
+          <w:p>
+            <w:pPr>
+              <w:spacing w:before="0" w:after="0"/>
+            </w:pPr>
+            <w:r>
+              <w:rPr>
+                <w:sz w:val="20"/>
+              </w:rPr>
+              <w:t>Wolpaw and colleagues defined a brain-computer interface as a system that gives the brain a channel for communication and control that does not use the muscles (Wolpaw et al. 2002).</w:t>
+            </w:r>
+          </w:p>
+        </w:tc>
+        <w:tc>
+          <w:tcPr>
+            <w:tcW w:type="dxa" w:w="2792"/>
+          </w:tcPr>
+          <w:p>
+            <w:pPr>
+              <w:spacing w:before="0" w:after="0"/>
+            </w:pPr>
+            <w:r>
+              <w:rPr>
+                <w:sz w:val="20"/>
+              </w:rPr>
+              <w:t>A real fit exists for people who cannot use their hands; for everyone else the gain over a mouse or a voice is small.</w:t>
+            </w:r>
+          </w:p>
+        </w:tc>
+      </w:tr>
+      <w:tr>
+        <w:trPr>
+          <w:cantSplit/>
+        </w:trPr>
+        <w:tc>
+          <w:tcPr>
+            <w:tcW w:type="dxa" w:w="2024"/>
+          </w:tcPr>
+          <w:p>
+            <w:pPr>
+              <w:spacing w:before="0" w:after="0"/>
+            </w:pPr>
+            <w:r>
+              <w:rPr>
+                <w:sz w:val="20"/>
+              </w:rPr>
+              <w:t>Neurofeedback</w:t>
+            </w:r>
+          </w:p>
+        </w:tc>
+        <w:tc>
+          <w:tcPr>
+            <w:tcW w:type="dxa" w:w="4822"/>
+          </w:tcPr>
+          <w:p>
+            <w:pPr>
+              <w:spacing w:before="0" w:after="0"/>
+            </w:pPr>
+            <w:r>
+              <w:rPr>
+                <w:sz w:val="20"/>
+              </w:rPr>
+              <w:t>A meta-analysis of 13 trials with 520 children and adolescents with ADHD found significant effects only on ratings from assessors close to the treatment, and no significant effects on probably blinded ratings or in trials with sham controls; other authors dispute the conclusion (Cortese et al. 2016).</w:t>
+            </w:r>
+          </w:p>
+        </w:tc>
+        <w:tc>
+          <w:tcPr>
+            <w:tcW w:type="dxa" w:w="2792"/>
+          </w:tcPr>
+          <w:p>
+            <w:pPr>
+              <w:spacing w:before="0" w:after="0"/>
+            </w:pPr>
+            <w:r>
+              <w:rPr>
+                <w:sz w:val="20"/>
+              </w:rPr>
+              <w:t>A scientific look is not evidence: ask which outcome was measured and how blind the assessor was.</w:t>
+            </w:r>
+          </w:p>
+        </w:tc>
+      </w:tr>
+      <w:tr>
+        <w:trPr>
+          <w:cantSplit/>
+        </w:trPr>
+        <w:tc>
+          <w:tcPr>
+            <w:tcW w:type="dxa" w:w="2024"/>
+          </w:tcPr>
+          <w:p>
+            <w:pPr>
+              <w:spacing w:before="0" w:after="0"/>
+            </w:pPr>
+            <w:r>
+              <w:rPr>
+                <w:sz w:val="20"/>
+              </w:rPr>
+              <w:t>State of the field</w:t>
+            </w:r>
+          </w:p>
+        </w:tc>
+        <w:tc>
+          <w:tcPr>
+            <w:tcW w:type="dxa" w:w="4822"/>
+          </w:tcPr>
+          <w:p>
+            <w:pPr>
+              <w:spacing w:before="0" w:after="0"/>
+            </w:pPr>
+            <w:r>
+              <w:rPr>
+                <w:sz w:val="20"/>
+              </w:rPr>
+              <w:t>Reviews describe neurofeedback and real-time brain imaging as promising but with many open questions about effects and methods (Sitaram et al. 2017).</w:t>
+            </w:r>
+          </w:p>
+        </w:tc>
+        <w:tc>
+          <w:tcPr>
+            <w:tcW w:type="dxa" w:w="2792"/>
+          </w:tcPr>
+          <w:p>
+            <w:pPr>
+              <w:spacing w:before="0" w:after="0"/>
+            </w:pPr>
+            <w:r>
+              <w:rPr>
+                <w:sz w:val="20"/>
+              </w:rPr>
+              <w:t>Treat any commercial claim as a hypothesis until it is replicated.</w:t>
+            </w:r>
+          </w:p>
+        </w:tc>
+      </w:tr>
+    </w:tbl>
+    <w:p>
+      <w:pPr>
+        <w:spacing w:before="0" w:after="80"/>
+      </w:pPr>
+    </w:p>
     <w:tbl>
       <w:tblPr>
         <w:tblW w:w="9598" w:type="dxa"/>
@@ -4166,7 +4999,7 @@
             </w:pPr>
             <w:r>
               <w:rPr/>
-              <w:t>Tessel, Mara, Joon, Ines and Bastian are made up for this example; the gaze recordings are drawn for the lesson, not measured. Neurofeedback follows Sitaram et al. (2017); brain-computer interfaces for communication and control follow Wolpaw et al. (2002). The placements are a reading of the example, not a ranking of products.</w:t>
+              <w:t>Tessel, Mara, Joon, Ines and Bastian are made up for this example; the gaze recordings are drawn for the lesson, not measured. Neurofeedback follows Sitaram et al. (2017); brain-computer interfaces for communication and control follow Wolpaw et al. (2002). The placements are a reading of the example, not a ranking of products. The findings in the table of real evidence are real research results, rules and cases; the sources are listed below.</w:t>
             </w:r>
           </w:p>
         </w:tc>
@@ -4355,7 +5188,7 @@
           <w:color w:val="556274"/>
           <w:sz w:val="18"/>
         </w:rPr>
-        <w:t>Sitaram et al. 2017 · Wolpaw et al. 2002</w:t>
+        <w:t>Sitaram et al. 2017 · Wolpaw et al. 2002 · Cortese et al. 2016</w:t>
       </w:r>
     </w:p>
     <w:p>
@@ -4590,6 +5423,266 @@
         <w:t>Figure 6 · Fund the question, not the technology: from a question to a decision.</w:t>
       </w:r>
     </w:p>
+    <w:p>
+      <w:pPr>
+        <w:spacing w:before="0" w:after="100"/>
+      </w:pPr>
+      <w:r>
+        <w:rPr>
+          <w:b/>
+        </w:rPr>
+        <w:t>Insight, interpretation risk and relevance: three tracks</w:t>
+      </w:r>
+    </w:p>
+    <w:tbl>
+      <w:tblPr>
+        <w:tblW w:w="9638" w:type="dxa"/>
+        <w:tblBorders>
+          <w:top w:val="single" w:sz="4" w:space="0" w:color="D5DEE9"/>
+          <w:left w:val="single" w:sz="4" w:space="0" w:color="D5DEE9"/>
+          <w:bottom w:val="single" w:sz="4" w:space="0" w:color="D5DEE9"/>
+          <w:right w:val="single" w:sz="4" w:space="0" w:color="D5DEE9"/>
+          <w:insideH w:val="single" w:sz="4" w:space="0" w:color="D5DEE9"/>
+          <w:insideV w:val="single" w:sz="4" w:space="0" w:color="D5DEE9"/>
+        </w:tblBorders>
+        <w:tblLayout w:type="fixed"/>
+        <w:tblCellMar>
+          <w:top w:w="60" w:type="dxa"/>
+          <w:left w:w="100" w:type="dxa"/>
+          <w:bottom w:w="60" w:type="dxa"/>
+          <w:right w:w="100" w:type="dxa"/>
+        </w:tblCellMar>
+      </w:tblPr>
+      <w:tblGrid>
+        <w:gridCol w:w="1967"/>
+        <w:gridCol w:w="4623"/>
+        <w:gridCol w:w="3048"/>
+      </w:tblGrid>
+      <w:tr>
+        <w:trPr>
+          <w:cantSplit/>
+          <w:tblHeader/>
+        </w:trPr>
+        <w:tc>
+          <w:tcPr>
+            <w:tcW w:type="dxa" w:w="1967"/>
+            <w:shd w:val="clear" w:color="auto" w:fill="E6ECF4"/>
+          </w:tcPr>
+          <w:p>
+            <w:pPr>
+              <w:spacing w:before="0" w:after="0"/>
+            </w:pPr>
+            <w:r>
+              <w:rPr>
+                <w:b/>
+                <w:sz w:val="20"/>
+              </w:rPr>
+              <w:t>Track</w:t>
+            </w:r>
+          </w:p>
+        </w:tc>
+        <w:tc>
+          <w:tcPr>
+            <w:tcW w:type="dxa" w:w="4623"/>
+            <w:shd w:val="clear" w:color="auto" w:fill="E6ECF4"/>
+          </w:tcPr>
+          <w:p>
+            <w:pPr>
+              <w:spacing w:before="0" w:after="0"/>
+            </w:pPr>
+            <w:r>
+              <w:rPr>
+                <w:b/>
+                <w:sz w:val="20"/>
+              </w:rPr>
+              <w:t>Real example</w:t>
+            </w:r>
+          </w:p>
+        </w:tc>
+        <w:tc>
+          <w:tcPr>
+            <w:tcW w:type="dxa" w:w="3048"/>
+            <w:shd w:val="clear" w:color="auto" w:fill="E6ECF4"/>
+          </w:tcPr>
+          <w:p>
+            <w:pPr>
+              <w:spacing w:before="0" w:after="0"/>
+            </w:pPr>
+            <w:r>
+              <w:rPr>
+                <w:b/>
+                <w:sz w:val="20"/>
+              </w:rPr>
+              <w:t>What it means for a decision</w:t>
+            </w:r>
+          </w:p>
+        </w:tc>
+      </w:tr>
+      <w:tr>
+        <w:trPr>
+          <w:cantSplit/>
+        </w:trPr>
+        <w:tc>
+          <w:tcPr>
+            <w:tcW w:type="dxa" w:w="1967"/>
+          </w:tcPr>
+          <w:p>
+            <w:pPr>
+              <w:spacing w:before="0" w:after="0"/>
+            </w:pPr>
+            <w:r>
+              <w:rPr>
+                <w:sz w:val="20"/>
+              </w:rPr>
+              <w:t>Robust research</w:t>
+            </w:r>
+          </w:p>
+        </w:tc>
+        <w:tc>
+          <w:tcPr>
+            <w:tcW w:type="dxa" w:w="4623"/>
+          </w:tcPr>
+          <w:p>
+            <w:pPr>
+              <w:spacing w:before="0" w:after="0"/>
+            </w:pPr>
+            <w:r>
+              <w:rPr>
+                <w:sz w:val="20"/>
+              </w:rPr>
+              <w:t>Eye-tracking in usability tests with a defined question, calibrated devices and enough participants (Holmqvist et al. 2011; Nielsen 2009, as reported).</w:t>
+            </w:r>
+          </w:p>
+        </w:tc>
+        <w:tc>
+          <w:tcPr>
+            <w:tcW w:type="dxa" w:w="3048"/>
+          </w:tcPr>
+          <w:p>
+            <w:pPr>
+              <w:spacing w:before="0" w:after="0"/>
+            </w:pPr>
+            <w:r>
+              <w:rPr>
+                <w:sz w:val="20"/>
+              </w:rPr>
+              <w:t>Use it now, for evaluation, with the limits stated.</w:t>
+            </w:r>
+          </w:p>
+        </w:tc>
+      </w:tr>
+      <w:tr>
+        <w:trPr>
+          <w:cantSplit/>
+        </w:trPr>
+        <w:tc>
+          <w:tcPr>
+            <w:tcW w:type="dxa" w:w="1967"/>
+          </w:tcPr>
+          <w:p>
+            <w:pPr>
+              <w:spacing w:before="0" w:after="0"/>
+            </w:pPr>
+            <w:r>
+              <w:rPr>
+                <w:sz w:val="20"/>
+              </w:rPr>
+              <w:t>Experimental technology</w:t>
+            </w:r>
+          </w:p>
+        </w:tc>
+        <w:tc>
+          <w:tcPr>
+            <w:tcW w:type="dxa" w:w="4623"/>
+          </w:tcPr>
+          <w:p>
+            <w:pPr>
+              <w:spacing w:before="0" w:after="0"/>
+            </w:pPr>
+            <w:r>
+              <w:rPr>
+                <w:sz w:val="20"/>
+              </w:rPr>
+              <w:t>Neurofeedback for attention is contested in controlled trials (Cortese et al. 2016).</w:t>
+            </w:r>
+          </w:p>
+        </w:tc>
+        <w:tc>
+          <w:tcPr>
+            <w:tcW w:type="dxa" w:w="3048"/>
+          </w:tcPr>
+          <w:p>
+            <w:pPr>
+              <w:spacing w:before="0" w:after="0"/>
+            </w:pPr>
+            <w:r>
+              <w:rPr>
+                <w:sz w:val="20"/>
+              </w:rPr>
+              <w:t>Run it as a small, controlled experiment with a university, not as a product feature.</w:t>
+            </w:r>
+          </w:p>
+        </w:tc>
+      </w:tr>
+      <w:tr>
+        <w:trPr>
+          <w:cantSplit/>
+        </w:trPr>
+        <w:tc>
+          <w:tcPr>
+            <w:tcW w:type="dxa" w:w="1967"/>
+          </w:tcPr>
+          <w:p>
+            <w:pPr>
+              <w:spacing w:before="0" w:after="0"/>
+            </w:pPr>
+            <w:r>
+              <w:rPr>
+                <w:sz w:val="20"/>
+              </w:rPr>
+              <w:t>Marketable application</w:t>
+            </w:r>
+          </w:p>
+        </w:tc>
+        <w:tc>
+          <w:tcPr>
+            <w:tcW w:type="dxa" w:w="4623"/>
+          </w:tcPr>
+          <w:p>
+            <w:pPr>
+              <w:spacing w:before="0" w:after="0"/>
+            </w:pPr>
+            <w:r>
+              <w:rPr>
+                <w:sz w:val="20"/>
+              </w:rPr>
+              <w:t>The EU AI Act prohibits emotion recognition in the workplace and in education, with an exception for medical or safety reasons (Article 5(1)(f), applicable since 2 February 2025).</w:t>
+            </w:r>
+          </w:p>
+        </w:tc>
+        <w:tc>
+          <w:tcPr>
+            <w:tcW w:type="dxa" w:w="3048"/>
+          </w:tcPr>
+          <w:p>
+            <w:pPr>
+              <w:spacing w:before="0" w:after="0"/>
+            </w:pPr>
+            <w:r>
+              <w:rPr>
+                <w:sz w:val="20"/>
+              </w:rPr>
+              <w:t>Check the law before the market: some applications are not allowed at all.</w:t>
+            </w:r>
+          </w:p>
+        </w:tc>
+      </w:tr>
+    </w:tbl>
+    <w:p>
+      <w:pPr>
+        <w:spacing w:before="0" w:after="80"/>
+      </w:pPr>
+    </w:p>
     <w:tbl>
       <w:tblPr>
         <w:tblW w:w="9598" w:type="dxa"/>
@@ -4639,7 +5732,7 @@
             </w:pPr>
             <w:r>
               <w:rPr/>
-              <w:t>Tessel, Mara, Joon, Ines and Bastian are made up for this example; the gaze recordings are drawn for the lesson, not measured. Narrow questions, one feature at a time and measurable outcomes follow Tobii's own advice to UX researchers (2019).</w:t>
+              <w:t>Tessel, Mara, Joon, Ines and Bastian are made up for this example; the gaze recordings are drawn for the lesson, not measured. Narrow questions, one feature at a time and measurable outcomes follow Tobii's own advice to UX researchers (2019). The findings in the table of real evidence are real research results, rules and cases; the sources are listed below.</w:t>
             </w:r>
           </w:p>
         </w:tc>
@@ -4828,7 +5921,7 @@
           <w:color w:val="556274"/>
           <w:sz w:val="18"/>
         </w:rPr>
-        <w:t>Tobii 2019 · Holmqvist et al. 2011</w:t>
+        <w:t>Tobii 2019 · Holmqvist et al. 2011 · Nielsen 2009 · Cortese et al. 2016 · EU AI Act 2024</w:t>
       </w:r>
     </w:p>
     <w:p>
@@ -5063,6 +6156,319 @@
         <w:t>Figure 8 · Tessel weighs three measures on effect on users, feasibility, risk, time pressure and reputation security.</w:t>
       </w:r>
     </w:p>
+    <w:p>
+      <w:pPr>
+        <w:spacing w:before="0" w:after="100"/>
+      </w:pPr>
+      <w:r>
+        <w:rPr>
+          <w:b/>
+        </w:rPr>
+        <w:t>Ethics, data protection and voluntariness: real rules</w:t>
+      </w:r>
+    </w:p>
+    <w:tbl>
+      <w:tblPr>
+        <w:tblW w:w="9638" w:type="dxa"/>
+        <w:tblBorders>
+          <w:top w:val="single" w:sz="4" w:space="0" w:color="D5DEE9"/>
+          <w:left w:val="single" w:sz="4" w:space="0" w:color="D5DEE9"/>
+          <w:bottom w:val="single" w:sz="4" w:space="0" w:color="D5DEE9"/>
+          <w:right w:val="single" w:sz="4" w:space="0" w:color="D5DEE9"/>
+          <w:insideH w:val="single" w:sz="4" w:space="0" w:color="D5DEE9"/>
+          <w:insideV w:val="single" w:sz="4" w:space="0" w:color="D5DEE9"/>
+        </w:tblBorders>
+        <w:tblLayout w:type="fixed"/>
+        <w:tblCellMar>
+          <w:top w:w="60" w:type="dxa"/>
+          <w:left w:w="100" w:type="dxa"/>
+          <w:bottom w:w="60" w:type="dxa"/>
+          <w:right w:w="100" w:type="dxa"/>
+        </w:tblCellMar>
+      </w:tblPr>
+      <w:tblGrid>
+        <w:gridCol w:w="1637"/>
+        <w:gridCol w:w="5194"/>
+        <w:gridCol w:w="2807"/>
+      </w:tblGrid>
+      <w:tr>
+        <w:trPr>
+          <w:cantSplit/>
+          <w:tblHeader/>
+        </w:trPr>
+        <w:tc>
+          <w:tcPr>
+            <w:tcW w:type="dxa" w:w="1637"/>
+            <w:shd w:val="clear" w:color="auto" w:fill="E6ECF4"/>
+          </w:tcPr>
+          <w:p>
+            <w:pPr>
+              <w:spacing w:before="0" w:after="0"/>
+            </w:pPr>
+            <w:r>
+              <w:rPr>
+                <w:b/>
+                <w:sz w:val="20"/>
+              </w:rPr>
+              <w:t>Source</w:t>
+            </w:r>
+          </w:p>
+        </w:tc>
+        <w:tc>
+          <w:tcPr>
+            <w:tcW w:type="dxa" w:w="5194"/>
+            <w:shd w:val="clear" w:color="auto" w:fill="E6ECF4"/>
+          </w:tcPr>
+          <w:p>
+            <w:pPr>
+              <w:spacing w:before="0" w:after="0"/>
+            </w:pPr>
+            <w:r>
+              <w:rPr>
+                <w:b/>
+                <w:sz w:val="20"/>
+              </w:rPr>
+              <w:t>Real rule or finding</w:t>
+            </w:r>
+          </w:p>
+        </w:tc>
+        <w:tc>
+          <w:tcPr>
+            <w:tcW w:type="dxa" w:w="2807"/>
+            <w:shd w:val="clear" w:color="auto" w:fill="E6ECF4"/>
+          </w:tcPr>
+          <w:p>
+            <w:pPr>
+              <w:spacing w:before="0" w:after="0"/>
+            </w:pPr>
+            <w:r>
+              <w:rPr>
+                <w:b/>
+                <w:sz w:val="20"/>
+              </w:rPr>
+              <w:t>What it means for a measure</w:t>
+            </w:r>
+          </w:p>
+        </w:tc>
+      </w:tr>
+      <w:tr>
+        <w:trPr>
+          <w:cantSplit/>
+        </w:trPr>
+        <w:tc>
+          <w:tcPr>
+            <w:tcW w:type="dxa" w:w="1637"/>
+          </w:tcPr>
+          <w:p>
+            <w:pPr>
+              <w:spacing w:before="0" w:after="0"/>
+            </w:pPr>
+            <w:r>
+              <w:rPr>
+                <w:sz w:val="20"/>
+              </w:rPr>
+              <w:t>The UK regulator</w:t>
+            </w:r>
+          </w:p>
+        </w:tc>
+        <w:tc>
+          <w:tcPr>
+            <w:tcW w:type="dxa" w:w="5194"/>
+          </w:tcPr>
+          <w:p>
+            <w:pPr>
+              <w:spacing w:before="0" w:after="0"/>
+            </w:pPr>
+            <w:r>
+              <w:rPr>
+                <w:sz w:val="20"/>
+              </w:rPr>
+              <w:t>The Information Commissioner's Office reviewed neurotechnology and the data protection questions it raises, including special sensitivity of neural data and the risk of bias and inference (Information Commissioner's Office 2023).</w:t>
+            </w:r>
+          </w:p>
+        </w:tc>
+        <w:tc>
+          <w:tcPr>
+            <w:tcW w:type="dxa" w:w="2807"/>
+          </w:tcPr>
+          <w:p>
+            <w:pPr>
+              <w:spacing w:before="0" w:after="0"/>
+            </w:pPr>
+            <w:r>
+              <w:rPr>
+                <w:sz w:val="20"/>
+              </w:rPr>
+              <w:t>Do a data protection impact assessment before a neuro study.</w:t>
+            </w:r>
+          </w:p>
+        </w:tc>
+      </w:tr>
+      <w:tr>
+        <w:trPr>
+          <w:cantSplit/>
+        </w:trPr>
+        <w:tc>
+          <w:tcPr>
+            <w:tcW w:type="dxa" w:w="1637"/>
+          </w:tcPr>
+          <w:p>
+            <w:pPr>
+              <w:spacing w:before="0" w:after="0"/>
+            </w:pPr>
+            <w:r>
+              <w:rPr>
+                <w:sz w:val="20"/>
+              </w:rPr>
+              <w:t>New rights</w:t>
+            </w:r>
+          </w:p>
+        </w:tc>
+        <w:tc>
+          <w:tcPr>
+            <w:tcW w:type="dxa" w:w="5194"/>
+          </w:tcPr>
+          <w:p>
+            <w:pPr>
+              <w:spacing w:before="0" w:after="0"/>
+            </w:pPr>
+            <w:r>
+              <w:rPr>
+                <w:sz w:val="20"/>
+              </w:rPr>
+              <w:t>Ienca and Andorno proposed new human rights for the age of neurotechnology, among them cognitive liberty and mental privacy (Ienca and Andorno 2017).</w:t>
+            </w:r>
+          </w:p>
+        </w:tc>
+        <w:tc>
+          <w:tcPr>
+            <w:tcW w:type="dxa" w:w="2807"/>
+          </w:tcPr>
+          <w:p>
+            <w:pPr>
+              <w:spacing w:before="0" w:after="0"/>
+            </w:pPr>
+            <w:r>
+              <w:rPr>
+                <w:sz w:val="20"/>
+              </w:rPr>
+              <w:t>Voluntary, informed and revocable participation is the minimum.</w:t>
+            </w:r>
+          </w:p>
+        </w:tc>
+      </w:tr>
+      <w:tr>
+        <w:trPr>
+          <w:cantSplit/>
+        </w:trPr>
+        <w:tc>
+          <w:tcPr>
+            <w:tcW w:type="dxa" w:w="1637"/>
+          </w:tcPr>
+          <w:p>
+            <w:pPr>
+              <w:spacing w:before="0" w:after="0"/>
+            </w:pPr>
+            <w:r>
+              <w:rPr>
+                <w:sz w:val="20"/>
+              </w:rPr>
+              <w:t>Law</w:t>
+            </w:r>
+          </w:p>
+        </w:tc>
+        <w:tc>
+          <w:tcPr>
+            <w:tcW w:type="dxa" w:w="5194"/>
+          </w:tcPr>
+          <w:p>
+            <w:pPr>
+              <w:spacing w:before="0" w:after="0"/>
+            </w:pPr>
+            <w:r>
+              <w:rPr>
+                <w:sz w:val="20"/>
+              </w:rPr>
+              <w:t>Chile amended its constitution in 2021 to protect brain activity and the information derived from it (Law 21.383), and Colorado extended its privacy law in 2024 to neural data, with express consent (as reported).</w:t>
+            </w:r>
+          </w:p>
+        </w:tc>
+        <w:tc>
+          <w:tcPr>
+            <w:tcW w:type="dxa" w:w="2807"/>
+          </w:tcPr>
+          <w:p>
+            <w:pPr>
+              <w:spacing w:before="0" w:after="0"/>
+            </w:pPr>
+            <w:r>
+              <w:rPr>
+                <w:sz w:val="20"/>
+              </w:rPr>
+              <w:t>Neural data is already regulated in places: ask where your users live.</w:t>
+            </w:r>
+          </w:p>
+        </w:tc>
+      </w:tr>
+      <w:tr>
+        <w:trPr>
+          <w:cantSplit/>
+        </w:trPr>
+        <w:tc>
+          <w:tcPr>
+            <w:tcW w:type="dxa" w:w="1637"/>
+          </w:tcPr>
+          <w:p>
+            <w:pPr>
+              <w:spacing w:before="0" w:after="0"/>
+            </w:pPr>
+            <w:r>
+              <w:rPr>
+                <w:sz w:val="20"/>
+              </w:rPr>
+              <w:t>Emotion recognition</w:t>
+            </w:r>
+          </w:p>
+        </w:tc>
+        <w:tc>
+          <w:tcPr>
+            <w:tcW w:type="dxa" w:w="5194"/>
+          </w:tcPr>
+          <w:p>
+            <w:pPr>
+              <w:spacing w:before="0" w:after="0"/>
+            </w:pPr>
+            <w:r>
+              <w:rPr>
+                <w:sz w:val="20"/>
+              </w:rPr>
+              <w:t>The EU AI Act prohibits emotion recognition systems in workplaces and educational institutions, with medical and safety exceptions (Article 5(1)(f)).</w:t>
+            </w:r>
+          </w:p>
+        </w:tc>
+        <w:tc>
+          <w:tcPr>
+            <w:tcW w:type="dxa" w:w="2807"/>
+          </w:tcPr>
+          <w:p>
+            <w:pPr>
+              <w:spacing w:before="0" w:after="0"/>
+            </w:pPr>
+            <w:r>
+              <w:rPr>
+                <w:sz w:val="20"/>
+              </w:rPr>
+              <w:t>Do not use gaze or physiology to infer feelings of employees or students.</w:t>
+            </w:r>
+          </w:p>
+        </w:tc>
+      </w:tr>
+    </w:tbl>
+    <w:p>
+      <w:pPr>
+        <w:spacing w:before="0" w:after="80"/>
+      </w:pPr>
+    </w:p>
     <w:tbl>
       <w:tblPr>
         <w:tblW w:w="9598" w:type="dxa"/>
@@ -5112,7 +6518,7 @@
             </w:pPr>
             <w:r>
               <w:rPr/>
-              <w:t>Tessel, Mara, Joon, Ines and Bastian are made up for this example; the gaze recordings are drawn for the lesson, not measured. Neurodata as high risk and the limits of consent follow the UK ICO (2023); mental privacy follows Ienca and Andorno (2017); rating options on the same criteria follows Gibbons (2018).</w:t>
+              <w:t>Tessel, Mara, Joon, Ines and Bastian are made up for this example; the gaze recordings are drawn for the lesson, not measured. Neurodata as high risk and the limits of consent follow the UK ICO (2023); mental privacy follows Ienca and Andorno (2017); rating options on the same criteria follows Gibbons (2018). The findings in the table of real evidence are real research results, rules and cases; the sources are listed below.</w:t>
             </w:r>
           </w:p>
         </w:tc>
@@ -5301,7 +6707,7 @@
           <w:color w:val="556274"/>
           <w:sz w:val="18"/>
         </w:rPr>
-        <w:t>ICO 2023 · Ienca &amp; Andorno 2017 · Gibbons 2018</w:t>
+        <w:t>ICO 2023 · Ienca &amp; Andorno 2017 · Gibbons 2018 · Chile Law 21.383 and Colorado 2024 · EU AI Act 2024</w:t>
       </w:r>
     </w:p>
     <w:p>
@@ -5608,6 +7014,266 @@
         <w:t>Figure 10 · The layers of an insight architecture, from a guiding vision to every study.</w:t>
       </w:r>
     </w:p>
+    <w:p>
+      <w:pPr>
+        <w:spacing w:before="0" w:after="100"/>
+      </w:pPr>
+      <w:r>
+        <w:rPr>
+          <w:b/>
+        </w:rPr>
+        <w:t>Neuro-based UX as an insight architecture: structures</w:t>
+      </w:r>
+    </w:p>
+    <w:tbl>
+      <w:tblPr>
+        <w:tblW w:w="9638" w:type="dxa"/>
+        <w:tblBorders>
+          <w:top w:val="single" w:sz="4" w:space="0" w:color="D5DEE9"/>
+          <w:left w:val="single" w:sz="4" w:space="0" w:color="D5DEE9"/>
+          <w:bottom w:val="single" w:sz="4" w:space="0" w:color="D5DEE9"/>
+          <w:right w:val="single" w:sz="4" w:space="0" w:color="D5DEE9"/>
+          <w:insideH w:val="single" w:sz="4" w:space="0" w:color="D5DEE9"/>
+          <w:insideV w:val="single" w:sz="4" w:space="0" w:color="D5DEE9"/>
+        </w:tblBorders>
+        <w:tblLayout w:type="fixed"/>
+        <w:tblCellMar>
+          <w:top w:w="60" w:type="dxa"/>
+          <w:left w:w="100" w:type="dxa"/>
+          <w:bottom w:w="60" w:type="dxa"/>
+          <w:right w:w="100" w:type="dxa"/>
+        </w:tblCellMar>
+      </w:tblPr>
+      <w:tblGrid>
+        <w:gridCol w:w="1658"/>
+        <w:gridCol w:w="5163"/>
+        <w:gridCol w:w="2817"/>
+      </w:tblGrid>
+      <w:tr>
+        <w:trPr>
+          <w:cantSplit/>
+          <w:tblHeader/>
+        </w:trPr>
+        <w:tc>
+          <w:tcPr>
+            <w:tcW w:type="dxa" w:w="1658"/>
+            <w:shd w:val="clear" w:color="auto" w:fill="E6ECF4"/>
+          </w:tcPr>
+          <w:p>
+            <w:pPr>
+              <w:spacing w:before="0" w:after="0"/>
+            </w:pPr>
+            <w:r>
+              <w:rPr>
+                <w:b/>
+                <w:sz w:val="20"/>
+              </w:rPr>
+              <w:t>Part</w:t>
+            </w:r>
+          </w:p>
+        </w:tc>
+        <w:tc>
+          <w:tcPr>
+            <w:tcW w:type="dxa" w:w="5163"/>
+            <w:shd w:val="clear" w:color="auto" w:fill="E6ECF4"/>
+          </w:tcPr>
+          <w:p>
+            <w:pPr>
+              <w:spacing w:before="0" w:after="0"/>
+            </w:pPr>
+            <w:r>
+              <w:rPr>
+                <w:b/>
+                <w:sz w:val="20"/>
+              </w:rPr>
+              <w:t>Real example</w:t>
+            </w:r>
+          </w:p>
+        </w:tc>
+        <w:tc>
+          <w:tcPr>
+            <w:tcW w:type="dxa" w:w="2817"/>
+            <w:shd w:val="clear" w:color="auto" w:fill="E6ECF4"/>
+          </w:tcPr>
+          <w:p>
+            <w:pPr>
+              <w:spacing w:before="0" w:after="0"/>
+            </w:pPr>
+            <w:r>
+              <w:rPr>
+                <w:b/>
+                <w:sz w:val="20"/>
+              </w:rPr>
+              <w:t>What it means</w:t>
+            </w:r>
+          </w:p>
+        </w:tc>
+      </w:tr>
+      <w:tr>
+        <w:trPr>
+          <w:cantSplit/>
+        </w:trPr>
+        <w:tc>
+          <w:tcPr>
+            <w:tcW w:type="dxa" w:w="1658"/>
+          </w:tcPr>
+          <w:p>
+            <w:pPr>
+              <w:spacing w:before="0" w:after="0"/>
+            </w:pPr>
+            <w:r>
+              <w:rPr>
+                <w:sz w:val="20"/>
+              </w:rPr>
+              <w:t>A ladder of evidence</w:t>
+            </w:r>
+          </w:p>
+        </w:tc>
+        <w:tc>
+          <w:tcPr>
+            <w:tcW w:type="dxa" w:w="5163"/>
+          </w:tcPr>
+          <w:p>
+            <w:pPr>
+              <w:spacing w:before="0" w:after="0"/>
+            </w:pPr>
+            <w:r>
+              <w:rPr>
+                <w:sz w:val="20"/>
+              </w:rPr>
+              <w:t>Eye-tracking is robust for questions about where people look; claims about feelings or understanding need further evidence (Holmqvist et al. 2011; Just and Carpenter 1980).</w:t>
+            </w:r>
+          </w:p>
+        </w:tc>
+        <w:tc>
+          <w:tcPr>
+            <w:tcW w:type="dxa" w:w="2817"/>
+          </w:tcPr>
+          <w:p>
+            <w:pPr>
+              <w:spacing w:before="0" w:after="0"/>
+            </w:pPr>
+            <w:r>
+              <w:rPr>
+                <w:sz w:val="20"/>
+              </w:rPr>
+              <w:t>Grade each finding: recorded, interpreted, tested.</w:t>
+            </w:r>
+          </w:p>
+        </w:tc>
+      </w:tr>
+      <w:tr>
+        <w:trPr>
+          <w:cantSplit/>
+        </w:trPr>
+        <w:tc>
+          <w:tcPr>
+            <w:tcW w:type="dxa" w:w="1658"/>
+          </w:tcPr>
+          <w:p>
+            <w:pPr>
+              <w:spacing w:before="0" w:after="0"/>
+            </w:pPr>
+            <w:r>
+              <w:rPr>
+                <w:sz w:val="20"/>
+              </w:rPr>
+              <w:t>Regulator guidance</w:t>
+            </w:r>
+          </w:p>
+        </w:tc>
+        <w:tc>
+          <w:tcPr>
+            <w:tcW w:type="dxa" w:w="5163"/>
+          </w:tcPr>
+          <w:p>
+            <w:pPr>
+              <w:spacing w:before="0" w:after="0"/>
+            </w:pPr>
+            <w:r>
+              <w:rPr>
+                <w:sz w:val="20"/>
+              </w:rPr>
+              <w:t>The ICO sets out how data protection applies to neurotechnology (Information Commissioner's Office 2023).</w:t>
+            </w:r>
+          </w:p>
+        </w:tc>
+        <w:tc>
+          <w:tcPr>
+            <w:tcW w:type="dxa" w:w="2817"/>
+          </w:tcPr>
+          <w:p>
+            <w:pPr>
+              <w:spacing w:before="0" w:after="0"/>
+            </w:pPr>
+            <w:r>
+              <w:rPr>
+                <w:sz w:val="20"/>
+              </w:rPr>
+              <w:t>Build the review into the research process.</w:t>
+            </w:r>
+          </w:p>
+        </w:tc>
+      </w:tr>
+      <w:tr>
+        <w:trPr>
+          <w:cantSplit/>
+        </w:trPr>
+        <w:tc>
+          <w:tcPr>
+            <w:tcW w:type="dxa" w:w="1658"/>
+          </w:tcPr>
+          <w:p>
+            <w:pPr>
+              <w:spacing w:before="0" w:after="0"/>
+            </w:pPr>
+            <w:r>
+              <w:rPr>
+                <w:sz w:val="20"/>
+              </w:rPr>
+              <w:t>Vendor claims</w:t>
+            </w:r>
+          </w:p>
+        </w:tc>
+        <w:tc>
+          <w:tcPr>
+            <w:tcW w:type="dxa" w:w="5163"/>
+          </w:tcPr>
+          <w:p>
+            <w:pPr>
+              <w:spacing w:before="0" w:after="0"/>
+            </w:pPr>
+            <w:r>
+              <w:rPr>
+                <w:sz w:val="20"/>
+              </w:rPr>
+              <w:t>A device maker's documentation shows what a tool measures; the interpretation is yours (Tobii 2019).</w:t>
+            </w:r>
+          </w:p>
+        </w:tc>
+        <w:tc>
+          <w:tcPr>
+            <w:tcW w:type="dxa" w:w="2817"/>
+          </w:tcPr>
+          <w:p>
+            <w:pPr>
+              <w:spacing w:before="0" w:after="0"/>
+            </w:pPr>
+            <w:r>
+              <w:rPr>
+                <w:sz w:val="20"/>
+              </w:rPr>
+              <w:t>Ask the vendor for the validation behind each metric.</w:t>
+            </w:r>
+          </w:p>
+        </w:tc>
+      </w:tr>
+    </w:tbl>
+    <w:p>
+      <w:pPr>
+        <w:spacing w:before="0" w:after="80"/>
+      </w:pPr>
+    </w:p>
     <w:tbl>
       <w:tblPr>
         <w:tblW w:w="9598" w:type="dxa"/>
@@ -5657,7 +7323,7 @@
             </w:pPr>
             <w:r>
               <w:rPr/>
-              <w:t>Tessel, Mara, Joon, Ines and Bastian are made up for this example; the gaze recordings are drawn for the lesson, not measured. The regulator's concerns about neurodata follow the UK ICO (2023); framing each study narrowly follows Tobii (2019).</w:t>
+              <w:t>Tessel, Mara, Joon, Ines and Bastian are made up for this example; the gaze recordings are drawn for the lesson, not measured. The regulator's concerns about neurodata follow the UK ICO (2023); framing each study narrowly follows Tobii (2019). The findings in the table of real evidence are real research results, rules and cases; the sources are listed below.</w:t>
             </w:r>
           </w:p>
         </w:tc>
@@ -5846,7 +7512,7 @@
           <w:color w:val="556274"/>
           <w:sz w:val="18"/>
         </w:rPr>
-        <w:t>ICO 2023 · Tobii 2019</w:t>
+        <w:t>ICO 2023 · Tobii 2019 · Holmqvist et al. 2011 · Just &amp; Carpenter 1980</w:t>
       </w:r>
     </w:p>
     <w:p>
@@ -6339,6 +8005,319 @@
         <w:spacing w:before="0" w:after="80"/>
       </w:pPr>
     </w:p>
+    <w:p>
+      <w:pPr>
+        <w:spacing w:before="0" w:after="100"/>
+      </w:pPr>
+      <w:r>
+        <w:rPr>
+          <w:b/>
+        </w:rPr>
+        <w:t>Conflicts of neuro-based UX, with evidence</w:t>
+      </w:r>
+    </w:p>
+    <w:tbl>
+      <w:tblPr>
+        <w:tblW w:w="9638" w:type="dxa"/>
+        <w:tblBorders>
+          <w:top w:val="single" w:sz="4" w:space="0" w:color="D5DEE9"/>
+          <w:left w:val="single" w:sz="4" w:space="0" w:color="D5DEE9"/>
+          <w:bottom w:val="single" w:sz="4" w:space="0" w:color="D5DEE9"/>
+          <w:right w:val="single" w:sz="4" w:space="0" w:color="D5DEE9"/>
+          <w:insideH w:val="single" w:sz="4" w:space="0" w:color="D5DEE9"/>
+          <w:insideV w:val="single" w:sz="4" w:space="0" w:color="D5DEE9"/>
+        </w:tblBorders>
+        <w:tblLayout w:type="fixed"/>
+        <w:tblCellMar>
+          <w:top w:w="60" w:type="dxa"/>
+          <w:left w:w="100" w:type="dxa"/>
+          <w:bottom w:w="60" w:type="dxa"/>
+          <w:right w:w="100" w:type="dxa"/>
+        </w:tblCellMar>
+      </w:tblPr>
+      <w:tblGrid>
+        <w:gridCol w:w="2678"/>
+        <w:gridCol w:w="4496"/>
+        <w:gridCol w:w="2464"/>
+      </w:tblGrid>
+      <w:tr>
+        <w:trPr>
+          <w:cantSplit/>
+          <w:tblHeader/>
+        </w:trPr>
+        <w:tc>
+          <w:tcPr>
+            <w:tcW w:type="dxa" w:w="2678"/>
+            <w:shd w:val="clear" w:color="auto" w:fill="E6ECF4"/>
+          </w:tcPr>
+          <w:p>
+            <w:pPr>
+              <w:spacing w:before="0" w:after="0"/>
+            </w:pPr>
+            <w:r>
+              <w:rPr>
+                <w:b/>
+                <w:sz w:val="20"/>
+              </w:rPr>
+              <w:t>Conflict</w:t>
+            </w:r>
+          </w:p>
+        </w:tc>
+        <w:tc>
+          <w:tcPr>
+            <w:tcW w:type="dxa" w:w="4496"/>
+            <w:shd w:val="clear" w:color="auto" w:fill="E6ECF4"/>
+          </w:tcPr>
+          <w:p>
+            <w:pPr>
+              <w:spacing w:before="0" w:after="0"/>
+            </w:pPr>
+            <w:r>
+              <w:rPr>
+                <w:b/>
+                <w:sz w:val="20"/>
+              </w:rPr>
+              <w:t>What the evidence says</w:t>
+            </w:r>
+          </w:p>
+        </w:tc>
+        <w:tc>
+          <w:tcPr>
+            <w:tcW w:type="dxa" w:w="2464"/>
+            <w:shd w:val="clear" w:color="auto" w:fill="E6ECF4"/>
+          </w:tcPr>
+          <w:p>
+            <w:pPr>
+              <w:spacing w:before="0" w:after="0"/>
+            </w:pPr>
+            <w:r>
+              <w:rPr>
+                <w:b/>
+                <w:sz w:val="20"/>
+              </w:rPr>
+              <w:t>A way to decide</w:t>
+            </w:r>
+          </w:p>
+        </w:tc>
+      </w:tr>
+      <w:tr>
+        <w:trPr>
+          <w:cantSplit/>
+        </w:trPr>
+        <w:tc>
+          <w:tcPr>
+            <w:tcW w:type="dxa" w:w="2678"/>
+          </w:tcPr>
+          <w:p>
+            <w:pPr>
+              <w:spacing w:before="0" w:after="0"/>
+            </w:pPr>
+            <w:r>
+              <w:rPr>
+                <w:sz w:val="20"/>
+              </w:rPr>
+              <w:t>Insight against validity</w:t>
+            </w:r>
+          </w:p>
+        </w:tc>
+        <w:tc>
+          <w:tcPr>
+            <w:tcW w:type="dxa" w:w="4496"/>
+          </w:tcPr>
+          <w:p>
+            <w:pPr>
+              <w:spacing w:before="0" w:after="0"/>
+            </w:pPr>
+            <w:r>
+              <w:rPr>
+                <w:sz w:val="20"/>
+              </w:rPr>
+              <w:t>Neurofeedback effects vanished with blinded ratings in a meta-analysis (Cortese et al. 2016).</w:t>
+            </w:r>
+          </w:p>
+        </w:tc>
+        <w:tc>
+          <w:tcPr>
+            <w:tcW w:type="dxa" w:w="2464"/>
+          </w:tcPr>
+          <w:p>
+            <w:pPr>
+              <w:spacing w:before="0" w:after="0"/>
+            </w:pPr>
+            <w:r>
+              <w:rPr>
+                <w:sz w:val="20"/>
+              </w:rPr>
+              <w:t>Ask whether the measure means what it claims, here.</w:t>
+            </w:r>
+          </w:p>
+        </w:tc>
+      </w:tr>
+      <w:tr>
+        <w:trPr>
+          <w:cantSplit/>
+        </w:trPr>
+        <w:tc>
+          <w:tcPr>
+            <w:tcW w:type="dxa" w:w="2678"/>
+          </w:tcPr>
+          <w:p>
+            <w:pPr>
+              <w:spacing w:before="0" w:after="0"/>
+            </w:pPr>
+            <w:r>
+              <w:rPr>
+                <w:sz w:val="20"/>
+              </w:rPr>
+              <w:t>A scientific image against what the data carries</w:t>
+            </w:r>
+          </w:p>
+        </w:tc>
+        <w:tc>
+          <w:tcPr>
+            <w:tcW w:type="dxa" w:w="4496"/>
+          </w:tcPr>
+          <w:p>
+            <w:pPr>
+              <w:spacing w:before="0" w:after="0"/>
+            </w:pPr>
+            <w:r>
+              <w:rPr>
+                <w:sz w:val="20"/>
+              </w:rPr>
+              <w:t>A 39-person rule for heatmaps shows how much data a clean picture needs (Nielsen 2009, as reported).</w:t>
+            </w:r>
+          </w:p>
+        </w:tc>
+        <w:tc>
+          <w:tcPr>
+            <w:tcW w:type="dxa" w:w="2464"/>
+          </w:tcPr>
+          <w:p>
+            <w:pPr>
+              <w:spacing w:before="0" w:after="0"/>
+            </w:pPr>
+            <w:r>
+              <w:rPr>
+                <w:sz w:val="20"/>
+              </w:rPr>
+              <w:t>Put the claim on the right step of the evidence ladder.</w:t>
+            </w:r>
+          </w:p>
+        </w:tc>
+      </w:tr>
+      <w:tr>
+        <w:trPr>
+          <w:cantSplit/>
+        </w:trPr>
+        <w:tc>
+          <w:tcPr>
+            <w:tcW w:type="dxa" w:w="2678"/>
+          </w:tcPr>
+          <w:p>
+            <w:pPr>
+              <w:spacing w:before="0" w:after="0"/>
+            </w:pPr>
+            <w:r>
+              <w:rPr>
+                <w:sz w:val="20"/>
+              </w:rPr>
+              <w:t>Personalisation against privacy</w:t>
+            </w:r>
+          </w:p>
+        </w:tc>
+        <w:tc>
+          <w:tcPr>
+            <w:tcW w:type="dxa" w:w="4496"/>
+          </w:tcPr>
+          <w:p>
+            <w:pPr>
+              <w:spacing w:before="0" w:after="0"/>
+            </w:pPr>
+            <w:r>
+              <w:rPr>
+                <w:sz w:val="20"/>
+              </w:rPr>
+              <w:t>Neural data is regulated in some places (Chile 2021; Colorado 2024) and emotion recognition is banned at work and in schools in the EU (AI Act, Article 5(1)(f)).</w:t>
+            </w:r>
+          </w:p>
+        </w:tc>
+        <w:tc>
+          <w:tcPr>
+            <w:tcW w:type="dxa" w:w="2464"/>
+          </w:tcPr>
+          <w:p>
+            <w:pPr>
+              <w:spacing w:before="0" w:after="0"/>
+            </w:pPr>
+            <w:r>
+              <w:rPr>
+                <w:sz w:val="20"/>
+              </w:rPr>
+              <w:t>Ask what you would infer and whether people would agree.</w:t>
+            </w:r>
+          </w:p>
+        </w:tc>
+      </w:tr>
+      <w:tr>
+        <w:trPr>
+          <w:cantSplit/>
+        </w:trPr>
+        <w:tc>
+          <w:tcPr>
+            <w:tcW w:type="dxa" w:w="2678"/>
+          </w:tcPr>
+          <w:p>
+            <w:pPr>
+              <w:spacing w:before="0" w:after="0"/>
+            </w:pPr>
+            <w:r>
+              <w:rPr>
+                <w:sz w:val="20"/>
+              </w:rPr>
+              <w:t>Speed against interpretation effort</w:t>
+            </w:r>
+          </w:p>
+        </w:tc>
+        <w:tc>
+          <w:tcPr>
+            <w:tcW w:type="dxa" w:w="4496"/>
+          </w:tcPr>
+          <w:p>
+            <w:pPr>
+              <w:spacing w:before="0" w:after="0"/>
+            </w:pPr>
+            <w:r>
+              <w:rPr>
+                <w:sz w:val="20"/>
+              </w:rPr>
+              <w:t>Sample size depends on the question, from about five to 44 or more (Nielsen 2009; Behavior Research Methods 2025; as reported).</w:t>
+            </w:r>
+          </w:p>
+        </w:tc>
+        <w:tc>
+          <w:tcPr>
+            <w:tcW w:type="dxa" w:w="2464"/>
+          </w:tcPr>
+          <w:p>
+            <w:pPr>
+              <w:spacing w:before="0" w:after="0"/>
+            </w:pPr>
+            <w:r>
+              <w:rPr>
+                <w:sz w:val="20"/>
+              </w:rPr>
+              <w:t>Run the smallest study that answers the question.</w:t>
+            </w:r>
+          </w:p>
+        </w:tc>
+      </w:tr>
+    </w:tbl>
+    <w:p>
+      <w:pPr>
+        <w:spacing w:before="0" w:after="80"/>
+      </w:pPr>
+    </w:p>
     <w:tbl>
       <w:tblPr>
         <w:tblW w:w="9598" w:type="dxa"/>
@@ -6388,7 +8367,7 @@
             </w:pPr>
             <w:r>
               <w:rPr/>
-              <w:t>Tessel, Mara, Joon, Ines and Bastian are made up for this example; the gaze recordings are drawn for the lesson, not measured. The bets are a reading of the example, not a rule for every company.</w:t>
+              <w:t>Tessel, Mara, Joon, Ines and Bastian are made up for this example; the gaze recordings are drawn for the lesson, not measured. The bets are a reading of the example, not a rule for every company. The findings in the table of real evidence are real research results, rules and cases; the sources are listed below.</w:t>
             </w:r>
           </w:p>
         </w:tc>
@@ -6577,7 +8556,7 @@
           <w:color w:val="556274"/>
           <w:sz w:val="18"/>
         </w:rPr>
-        <w:t>ICO 2023 · Sitaram et al. 2017</w:t>
+        <w:t>ICO 2023 · Sitaram et al. 2017 · Cortese et al. 2016 · Nielsen 2009 · Chile Law 21.383 and Colorado 2024 · EU AI Act 2024 · Behavior Research Methods 2025</w:t>
       </w:r>
     </w:p>
     <w:p>
@@ -7070,6 +9049,266 @@
         <w:spacing w:before="0" w:after="80"/>
       </w:pPr>
     </w:p>
+    <w:p>
+      <w:pPr>
+        <w:spacing w:before="0" w:after="100"/>
+      </w:pPr>
+      <w:r>
+        <w:rPr>
+          <w:b/>
+        </w:rPr>
+        <w:t>Governance for neurodata: real references</w:t>
+      </w:r>
+    </w:p>
+    <w:tbl>
+      <w:tblPr>
+        <w:tblW w:w="9638" w:type="dxa"/>
+        <w:tblBorders>
+          <w:top w:val="single" w:sz="4" w:space="0" w:color="D5DEE9"/>
+          <w:left w:val="single" w:sz="4" w:space="0" w:color="D5DEE9"/>
+          <w:bottom w:val="single" w:sz="4" w:space="0" w:color="D5DEE9"/>
+          <w:right w:val="single" w:sz="4" w:space="0" w:color="D5DEE9"/>
+          <w:insideH w:val="single" w:sz="4" w:space="0" w:color="D5DEE9"/>
+          <w:insideV w:val="single" w:sz="4" w:space="0" w:color="D5DEE9"/>
+        </w:tblBorders>
+        <w:tblLayout w:type="fixed"/>
+        <w:tblCellMar>
+          <w:top w:w="60" w:type="dxa"/>
+          <w:left w:w="100" w:type="dxa"/>
+          <w:bottom w:w="60" w:type="dxa"/>
+          <w:right w:w="100" w:type="dxa"/>
+        </w:tblCellMar>
+      </w:tblPr>
+      <w:tblGrid>
+        <w:gridCol w:w="1662"/>
+        <w:gridCol w:w="4972"/>
+        <w:gridCol w:w="3004"/>
+      </w:tblGrid>
+      <w:tr>
+        <w:trPr>
+          <w:cantSplit/>
+          <w:tblHeader/>
+        </w:trPr>
+        <w:tc>
+          <w:tcPr>
+            <w:tcW w:type="dxa" w:w="1662"/>
+            <w:shd w:val="clear" w:color="auto" w:fill="E6ECF4"/>
+          </w:tcPr>
+          <w:p>
+            <w:pPr>
+              <w:spacing w:before="0" w:after="0"/>
+            </w:pPr>
+            <w:r>
+              <w:rPr>
+                <w:b/>
+                <w:sz w:val="20"/>
+              </w:rPr>
+              <w:t>Role</w:t>
+            </w:r>
+          </w:p>
+        </w:tc>
+        <w:tc>
+          <w:tcPr>
+            <w:tcW w:type="dxa" w:w="4972"/>
+            <w:shd w:val="clear" w:color="auto" w:fill="E6ECF4"/>
+          </w:tcPr>
+          <w:p>
+            <w:pPr>
+              <w:spacing w:before="0" w:after="0"/>
+            </w:pPr>
+            <w:r>
+              <w:rPr>
+                <w:b/>
+                <w:sz w:val="20"/>
+              </w:rPr>
+              <w:t>Real reference</w:t>
+            </w:r>
+          </w:p>
+        </w:tc>
+        <w:tc>
+          <w:tcPr>
+            <w:tcW w:type="dxa" w:w="3004"/>
+            <w:shd w:val="clear" w:color="auto" w:fill="E6ECF4"/>
+          </w:tcPr>
+          <w:p>
+            <w:pPr>
+              <w:spacing w:before="0" w:after="0"/>
+            </w:pPr>
+            <w:r>
+              <w:rPr>
+                <w:b/>
+                <w:sz w:val="20"/>
+              </w:rPr>
+              <w:t>What it means</w:t>
+            </w:r>
+          </w:p>
+        </w:tc>
+      </w:tr>
+      <w:tr>
+        <w:trPr>
+          <w:cantSplit/>
+        </w:trPr>
+        <w:tc>
+          <w:tcPr>
+            <w:tcW w:type="dxa" w:w="1662"/>
+          </w:tcPr>
+          <w:p>
+            <w:pPr>
+              <w:spacing w:before="0" w:after="0"/>
+            </w:pPr>
+            <w:r>
+              <w:rPr>
+                <w:sz w:val="20"/>
+              </w:rPr>
+              <w:t>Sets the standard</w:t>
+            </w:r>
+          </w:p>
+        </w:tc>
+        <w:tc>
+          <w:tcPr>
+            <w:tcW w:type="dxa" w:w="4972"/>
+          </w:tcPr>
+          <w:p>
+            <w:pPr>
+              <w:spacing w:before="0" w:after="0"/>
+            </w:pPr>
+            <w:r>
+              <w:rPr>
+                <w:sz w:val="20"/>
+              </w:rPr>
+              <w:t>The regulator's report is a basis for the evidence and data protection standard (Information Commissioner's Office 2023).</w:t>
+            </w:r>
+          </w:p>
+        </w:tc>
+        <w:tc>
+          <w:tcPr>
+            <w:tcW w:type="dxa" w:w="3004"/>
+          </w:tcPr>
+          <w:p>
+            <w:pPr>
+              <w:spacing w:before="0" w:after="0"/>
+            </w:pPr>
+            <w:r>
+              <w:rPr>
+                <w:sz w:val="20"/>
+              </w:rPr>
+              <w:t>Name an owner for the evidence grade.</w:t>
+            </w:r>
+          </w:p>
+        </w:tc>
+      </w:tr>
+      <w:tr>
+        <w:trPr>
+          <w:cantSplit/>
+        </w:trPr>
+        <w:tc>
+          <w:tcPr>
+            <w:tcW w:type="dxa" w:w="1662"/>
+          </w:tcPr>
+          <w:p>
+            <w:pPr>
+              <w:spacing w:before="0" w:after="0"/>
+            </w:pPr>
+            <w:r>
+              <w:rPr>
+                <w:sz w:val="20"/>
+              </w:rPr>
+              <w:t>Approves</w:t>
+            </w:r>
+          </w:p>
+        </w:tc>
+        <w:tc>
+          <w:tcPr>
+            <w:tcW w:type="dxa" w:w="4972"/>
+          </w:tcPr>
+          <w:p>
+            <w:pPr>
+              <w:spacing w:before="0" w:after="0"/>
+            </w:pPr>
+            <w:r>
+              <w:rPr>
+                <w:sz w:val="20"/>
+              </w:rPr>
+              <w:t>Participation must be voluntary and informed, with the right to withdraw (Ienca and Andorno 2017).</w:t>
+            </w:r>
+          </w:p>
+        </w:tc>
+        <w:tc>
+          <w:tcPr>
+            <w:tcW w:type="dxa" w:w="3004"/>
+          </w:tcPr>
+          <w:p>
+            <w:pPr>
+              <w:spacing w:before="0" w:after="0"/>
+            </w:pPr>
+            <w:r>
+              <w:rPr>
+                <w:sz w:val="20"/>
+              </w:rPr>
+              <w:t>Put an ethics and data review before every study, with the data protection officer.</w:t>
+            </w:r>
+          </w:p>
+        </w:tc>
+      </w:tr>
+      <w:tr>
+        <w:trPr>
+          <w:cantSplit/>
+        </w:trPr>
+        <w:tc>
+          <w:tcPr>
+            <w:tcW w:type="dxa" w:w="1662"/>
+          </w:tcPr>
+          <w:p>
+            <w:pPr>
+              <w:spacing w:before="0" w:after="0"/>
+            </w:pPr>
+            <w:r>
+              <w:rPr>
+                <w:sz w:val="20"/>
+              </w:rPr>
+              <w:t>Translates</w:t>
+            </w:r>
+          </w:p>
+        </w:tc>
+        <w:tc>
+          <w:tcPr>
+            <w:tcW w:type="dxa" w:w="4972"/>
+          </w:tcPr>
+          <w:p>
+            <w:pPr>
+              <w:spacing w:before="0" w:after="0"/>
+            </w:pPr>
+            <w:r>
+              <w:rPr>
+                <w:sz w:val="20"/>
+              </w:rPr>
+              <w:t>Findings that failed blinded tests (Cortese et al. 2016) show why only graded findings should reach a product.</w:t>
+            </w:r>
+          </w:p>
+        </w:tc>
+        <w:tc>
+          <w:tcPr>
+            <w:tcW w:type="dxa" w:w="3004"/>
+          </w:tcPr>
+          <w:p>
+            <w:pPr>
+              <w:spacing w:before="0" w:after="0"/>
+            </w:pPr>
+            <w:r>
+              <w:rPr>
+                <w:sz w:val="20"/>
+              </w:rPr>
+              <w:t>Let only graded findings go to the product decision.</w:t>
+            </w:r>
+          </w:p>
+        </w:tc>
+      </w:tr>
+    </w:tbl>
+    <w:p>
+      <w:pPr>
+        <w:spacing w:before="0" w:after="80"/>
+      </w:pPr>
+    </w:p>
     <w:tbl>
       <w:tblPr>
         <w:tblW w:w="9598" w:type="dxa"/>
@@ -7119,7 +9358,7 @@
             </w:pPr>
             <w:r>
               <w:rPr/>
-              <w:t>Tessel, Mara, Joon, Ines and Bastian are made up for this example; the gaze recordings are drawn for the lesson, not measured. The limits of consent at work follow the UK ICO (2023); deciding with limited information follows Simon (1956); imagining the failure in advance (premortem) follows Klein (2007).</w:t>
+              <w:t>Tessel, Mara, Joon, Ines and Bastian are made up for this example; the gaze recordings are drawn for the lesson, not measured. The limits of consent at work follow the UK ICO (2023); deciding with limited information follows Simon (1956); imagining the failure in advance (premortem) follows Klein (2007). The findings in the table of real evidence are real research results, rules and cases; the sources are listed below.</w:t>
             </w:r>
           </w:p>
         </w:tc>
@@ -7308,7 +9547,7 @@
           <w:color w:val="556274"/>
           <w:sz w:val="18"/>
         </w:rPr>
-        <w:t>ICO 2023 · Simon 1956 · Klein 2007</w:t>
+        <w:t>ICO 2023 · Simon 1956 · Klein 2007 · Ienca &amp; Andorno 2017 · Cortese et al. 2016</w:t>
       </w:r>
     </w:p>
     <w:p>
@@ -7981,6 +10220,42 @@
         <w:rPr>
           <w:sz w:val="19"/>
         </w:rPr>
+        <w:t>Rayner, K. (1998). Eye movements in reading and information processing: 20 years of research. Psychological Bulletin, 124(3), 372–422. (Only the fovea, about 2° of the visual field, sees sharply; the eyes jump in saccades and rest in fixations of about 200 to 300 ms, taking in information only while they rest.)</w:t>
+      </w:r>
+    </w:p>
+    <w:p>
+      <w:pPr>
+        <w:spacing w:before="0" w:after="80"/>
+        <w:ind w:left="283" w:hanging="283"/>
+      </w:pPr>
+      <w:r>
+        <w:rPr>
+          <w:sz w:val="19"/>
+        </w:rPr>
+        <w:t>Nielsen, J., &amp; Pernice, K. (2009). Eyetracking Web Usability. New Riders; and the Nielsen Norman Group eyetracking methodology report. (Advice of about 39 participants for stable heatmaps against about five for qualitative tests; figure from secondary quotation.)</w:t>
+      </w:r>
+    </w:p>
+    <w:p>
+      <w:pPr>
+        <w:spacing w:before="0" w:after="80"/>
+        <w:ind w:left="283" w:hanging="283"/>
+      </w:pPr>
+      <w:r>
+        <w:rPr>
+          <w:sz w:val="19"/>
+        </w:rPr>
+        <w:t>Behavior Research Methods (2025). Paper on sample sizes for eye-tracking studies (Utrecht University group; open access at research-portal.uu.nl). (No one-size-fits-all sample size; reference tables with examples from about 10 to 44 participants depending on the measure. Check the paper before quoting.)</w:t>
+      </w:r>
+    </w:p>
+    <w:p>
+      <w:pPr>
+        <w:spacing w:before="0" w:after="80"/>
+        <w:ind w:left="283" w:hanging="283"/>
+      </w:pPr>
+      <w:r>
+        <w:rPr>
+          <w:sz w:val="19"/>
+        </w:rPr>
         <w:t>Just, M. A., &amp; Carpenter, P. A. (1980). A theory of reading: From eye fixations to comprehension. Psychological Review, 87(4), 329–354. (The eye-mind assumption: what is fixated is being processed; longer fixations can mean more effort, not more liking.)</w:t>
       </w:r>
     </w:p>
@@ -8017,7 +10292,31 @@
         <w:rPr>
           <w:sz w:val="19"/>
         </w:rPr>
+        <w:t>Cortese, S., Ferrin, M., Brandeis, D., et al. (2016). Neurofeedback for attention-deficit/hyperactivity disorder: Meta-analysis of clinical and neuropsychological outcomes from randomized controlled trials. Journal of the American Academy of Child &amp; Adolescent Psychiatry, 55(6), 444–455. https://doi.org/10.1016/j.jaac.2016.03.007 (13 trials with 520 participants; effects not significant on probably blinded ratings or with sham controls; the conclusion is disputed by other authors.)</w:t>
+      </w:r>
+    </w:p>
+    <w:p>
+      <w:pPr>
+        <w:spacing w:before="0" w:after="80"/>
+        <w:ind w:left="283" w:hanging="283"/>
+      </w:pPr>
+      <w:r>
+        <w:rPr>
+          <w:sz w:val="19"/>
+        </w:rPr>
         <w:t>Tobii (2019, 13 November). Eye tracking and UX testing: when, how, and if you should use it. https://www.tobii.com/blog/eye-tracking-and-ux-testing (read 29.10.2026). (An eye-tracker maker's advice: narrow questions, measurable outcomes, retrospective think-aloud, pilot the test.)</w:t>
+      </w:r>
+    </w:p>
+    <w:p>
+      <w:pPr>
+        <w:spacing w:before="0" w:after="80"/>
+        <w:ind w:left="283" w:hanging="283"/>
+      </w:pPr>
+      <w:r>
+        <w:rPr>
+          <w:sz w:val="19"/>
+        </w:rPr>
+        <w:t>Regulation (EU) 2024/1689 of the European Parliament and of the Council laying down harmonised rules on artificial intelligence (Artificial Intelligence Act). Official Journal of the European Union, 12 July 2024. (Among other duties, people must be informed when they interact with an AI system; check the current state of its application before a course run.)</w:t>
       </w:r>
     </w:p>
     <w:p>
@@ -8054,6 +10353,18 @@
           <w:sz w:val="19"/>
         </w:rPr>
         <w:t>Gibbons, S. (2018). Using Prioritization Matrices to Inform UX Decisions. Nielsen Norman Group. https://www.nngroup.com/articles/prioritization-matrices/ (Rate each option on the same few criteria, such as value to the user against effort, and put the reason next to each rating.)</w:t>
+      </w:r>
+    </w:p>
+    <w:p>
+      <w:pPr>
+        <w:spacing w:before="0" w:after="80"/>
+        <w:ind w:left="283" w:hanging="283"/>
+      </w:pPr>
+      <w:r>
+        <w:rPr>
+          <w:sz w:val="19"/>
+        </w:rPr>
+        <w:t>Chile, Ley 21.383 (published October 2021), reform of Article 19 of the Constitution on scientific and technological development and the protection of brain activity and the information derived from it; Colorado General Assembly (2024), amendment of the Colorado Privacy Act to cover neural data. (Reported by news and legal commentary; check the texts.)</w:t>
       </w:r>
     </w:p>
     <w:p>
@@ -8126,9 +10437,9 @@
         </w:tblCellMar>
       </w:tblPr>
       <w:tblGrid>
-        <w:gridCol w:w="2174"/>
-        <w:gridCol w:w="5197"/>
-        <w:gridCol w:w="1356"/>
+        <w:gridCol w:w="2161"/>
+        <w:gridCol w:w="5217"/>
+        <w:gridCol w:w="1349"/>
         <w:gridCol w:w="911"/>
       </w:tblGrid>
       <w:tr>
@@ -8138,7 +10449,7 @@
         </w:trPr>
         <w:tc>
           <w:tcPr>
-            <w:tcW w:type="dxa" w:w="2174"/>
+            <w:tcW w:type="dxa" w:w="2161"/>
             <w:shd w:val="clear" w:color="auto" w:fill="E6ECF4"/>
           </w:tcPr>
           <w:p>
@@ -8156,7 +10467,7 @@
         </w:tc>
         <w:tc>
           <w:tcPr>
-            <w:tcW w:type="dxa" w:w="5197"/>
+            <w:tcW w:type="dxa" w:w="5217"/>
             <w:shd w:val="clear" w:color="auto" w:fill="E6ECF4"/>
           </w:tcPr>
           <w:p>
@@ -8174,7 +10485,7 @@
         </w:tc>
         <w:tc>
           <w:tcPr>
-            <w:tcW w:type="dxa" w:w="1356"/>
+            <w:tcW w:type="dxa" w:w="1349"/>
             <w:shd w:val="clear" w:color="auto" w:fill="E6ECF4"/>
           </w:tcPr>
           <w:p>
@@ -8215,7 +10526,7 @@
         </w:trPr>
         <w:tc>
           <w:tcPr>
-            <w:tcW w:type="dxa" w:w="2174"/>
+            <w:tcW w:type="dxa" w:w="2161"/>
           </w:tcPr>
           <w:p>
             <w:pPr>
@@ -8232,7 +10543,7 @@
         </w:tc>
         <w:tc>
           <w:tcPr>
-            <w:tcW w:type="dxa" w:w="5197"/>
+            <w:tcW w:type="dxa" w:w="5217"/>
           </w:tcPr>
           <w:p>
             <w:pPr>
@@ -8248,7 +10559,7 @@
         </w:tc>
         <w:tc>
           <w:tcPr>
-            <w:tcW w:type="dxa" w:w="1356"/>
+            <w:tcW w:type="dxa" w:w="1349"/>
           </w:tcPr>
           <w:p>
             <w:pPr>
@@ -8285,7 +10596,7 @@
         </w:trPr>
         <w:tc>
           <w:tcPr>
-            <w:tcW w:type="dxa" w:w="2174"/>
+            <w:tcW w:type="dxa" w:w="2161"/>
           </w:tcPr>
           <w:p>
             <w:pPr>
@@ -8296,13 +10607,13 @@
                 <w:b/>
                 <w:sz w:val="19"/>
               </w:rPr>
-              <w:t>Area of interest</w:t>
-            </w:r>
-          </w:p>
-        </w:tc>
-        <w:tc>
-          <w:tcPr>
-            <w:tcW w:type="dxa" w:w="5197"/>
+              <w:t>ADHD</w:t>
+            </w:r>
+          </w:p>
+        </w:tc>
+        <w:tc>
+          <w:tcPr>
+            <w:tcW w:type="dxa" w:w="5217"/>
           </w:tcPr>
           <w:p>
             <w:pPr>
@@ -8312,13 +10623,13 @@
               <w:rPr>
                 <w:sz w:val="19"/>
               </w:rPr>
-              <w:t>A part of a page marked before the analysis, for example the price or a button, so the time and order of looks at it can be counted.</w:t>
-            </w:r>
-          </w:p>
-        </w:tc>
-        <w:tc>
-          <w:tcPr>
-            <w:tcW w:type="dxa" w:w="1356"/>
+              <w:t>Attention deficit hyperactivity disorder: a different way of directing attention and controlling impulses; busy pages, distractions and long unstructured tasks are especially hard.</w:t>
+            </w:r>
+          </w:p>
+        </w:tc>
+        <w:tc>
+          <w:tcPr>
+            <w:tcW w:type="dxa" w:w="1349"/>
           </w:tcPr>
           <w:p>
             <w:pPr>
@@ -8344,7 +10655,7 @@
               <w:rPr>
                 <w:sz w:val="19"/>
               </w:rPr>
-              <w:t>Day 15</w:t>
+              <w:t>Day 13</w:t>
             </w:r>
           </w:p>
         </w:tc>
@@ -8355,7 +10666,7 @@
         </w:trPr>
         <w:tc>
           <w:tcPr>
-            <w:tcW w:type="dxa" w:w="2174"/>
+            <w:tcW w:type="dxa" w:w="2161"/>
           </w:tcPr>
           <w:p>
             <w:pPr>
@@ -8366,13 +10677,13 @@
                 <w:b/>
                 <w:sz w:val="19"/>
               </w:rPr>
-              <w:t>Attention</w:t>
-            </w:r>
-          </w:p>
-        </w:tc>
-        <w:tc>
-          <w:tcPr>
-            <w:tcW w:type="dxa" w:w="5197"/>
+              <w:t>Area of interest</w:t>
+            </w:r>
+          </w:p>
+        </w:tc>
+        <w:tc>
+          <w:tcPr>
+            <w:tcW w:type="dxa" w:w="5217"/>
           </w:tcPr>
           <w:p>
             <w:pPr>
@@ -8382,13 +10693,13 @@
               <w:rPr>
                 <w:sz w:val="19"/>
               </w:rPr>
-              <w:t>The mind's spotlight. Only a small part of a screen is processed at any moment; attention decides which part.</w:t>
-            </w:r>
-          </w:p>
-        </w:tc>
-        <w:tc>
-          <w:tcPr>
-            <w:tcW w:type="dxa" w:w="1356"/>
+              <w:t>A part of a page marked before the analysis, for example the price or a button, so the time and order of looks at it can be counted.</w:t>
+            </w:r>
+          </w:p>
+        </w:tc>
+        <w:tc>
+          <w:tcPr>
+            <w:tcW w:type="dxa" w:w="1349"/>
           </w:tcPr>
           <w:p>
             <w:pPr>
@@ -8398,7 +10709,7 @@
               <w:rPr>
                 <w:sz w:val="19"/>
               </w:rPr>
-              <w:t>A flashing banner takes attention away from the form you were filling in.</w:t>
+              <w:t>—</w:t>
             </w:r>
           </w:p>
         </w:tc>
@@ -8414,7 +10725,7 @@
               <w:rPr>
                 <w:sz w:val="19"/>
               </w:rPr>
-              <w:t>Day 1</w:t>
+              <w:t>Day 15</w:t>
             </w:r>
           </w:p>
         </w:tc>
@@ -8425,7 +10736,7 @@
         </w:trPr>
         <w:tc>
           <w:tcPr>
-            <w:tcW w:type="dxa" w:w="2174"/>
+            <w:tcW w:type="dxa" w:w="2161"/>
           </w:tcPr>
           <w:p>
             <w:pPr>
@@ -8436,13 +10747,13 @@
                 <w:b/>
                 <w:sz w:val="19"/>
               </w:rPr>
-              <w:t>Brain-computer interface (BCI)</w:t>
-            </w:r>
-          </w:p>
-        </w:tc>
-        <w:tc>
-          <w:tcPr>
-            <w:tcW w:type="dxa" w:w="5197"/>
+              <w:t>Attention</w:t>
+            </w:r>
+          </w:p>
+        </w:tc>
+        <w:tc>
+          <w:tcPr>
+            <w:tcW w:type="dxa" w:w="5217"/>
           </w:tcPr>
           <w:p>
             <w:pPr>
@@ -8452,13 +10763,13 @@
               <w:rPr>
                 <w:sz w:val="19"/>
               </w:rPr>
-              <w:t>A system that turns brain signals into commands for a computer, for example to type without moving; today mostly medical and research use.</w:t>
-            </w:r>
-          </w:p>
-        </w:tc>
-        <w:tc>
-          <w:tcPr>
-            <w:tcW w:type="dxa" w:w="1356"/>
+              <w:t>The mind's spotlight. Only a small part of a screen is processed at any moment; attention decides which part.</w:t>
+            </w:r>
+          </w:p>
+        </w:tc>
+        <w:tc>
+          <w:tcPr>
+            <w:tcW w:type="dxa" w:w="1349"/>
           </w:tcPr>
           <w:p>
             <w:pPr>
@@ -8468,7 +10779,7 @@
               <w:rPr>
                 <w:sz w:val="19"/>
               </w:rPr>
-              <w:t>—</w:t>
+              <w:t>A flashing banner takes attention away from the form you were filling in.</w:t>
             </w:r>
           </w:p>
         </w:tc>
@@ -8484,7 +10795,7 @@
               <w:rPr>
                 <w:sz w:val="19"/>
               </w:rPr>
-              <w:t>Day 15</w:t>
+              <w:t>Day 1</w:t>
             </w:r>
           </w:p>
         </w:tc>
@@ -8495,7 +10806,7 @@
         </w:trPr>
         <w:tc>
           <w:tcPr>
-            <w:tcW w:type="dxa" w:w="2174"/>
+            <w:tcW w:type="dxa" w:w="2161"/>
           </w:tcPr>
           <w:p>
             <w:pPr>
@@ -8506,13 +10817,13 @@
                 <w:b/>
                 <w:sz w:val="19"/>
               </w:rPr>
-              <w:t>Case assumption</w:t>
-            </w:r>
-          </w:p>
-        </w:tc>
-        <w:tc>
-          <w:tcPr>
-            <w:tcW w:type="dxa" w:w="5197"/>
+              <w:t>Brain-computer interface (BCI)</w:t>
+            </w:r>
+          </w:p>
+        </w:tc>
+        <w:tc>
+          <w:tcPr>
+            <w:tcW w:type="dxa" w:w="5217"/>
           </w:tcPr>
           <w:p>
             <w:pPr>
@@ -8522,13 +10833,13 @@
               <w:rPr>
                 <w:sz w:val="19"/>
               </w:rPr>
-              <w:t>A fact made up for this exercise to fill a gap in the plan's case. It is marked so you know it is not part of the plan.</w:t>
-            </w:r>
-          </w:p>
-        </w:tc>
-        <w:tc>
-          <w:tcPr>
-            <w:tcW w:type="dxa" w:w="1356"/>
+              <w:t>A system that turns brain signals into commands for a computer, for example to type without moving; today mostly medical and research use.</w:t>
+            </w:r>
+          </w:p>
+        </w:tc>
+        <w:tc>
+          <w:tcPr>
+            <w:tcW w:type="dxa" w:w="1349"/>
           </w:tcPr>
           <w:p>
             <w:pPr>
@@ -8554,7 +10865,7 @@
               <w:rPr>
                 <w:sz w:val="19"/>
               </w:rPr>
-              <w:t>Day 1</w:t>
+              <w:t>Day 15</w:t>
             </w:r>
           </w:p>
         </w:tc>
@@ -8565,7 +10876,7 @@
         </w:trPr>
         <w:tc>
           <w:tcPr>
-            <w:tcW w:type="dxa" w:w="2174"/>
+            <w:tcW w:type="dxa" w:w="2161"/>
           </w:tcPr>
           <w:p>
             <w:pPr>
@@ -8576,13 +10887,13 @@
                 <w:b/>
                 <w:sz w:val="19"/>
               </w:rPr>
-              <w:t>Chief Experience Officer</w:t>
-            </w:r>
-          </w:p>
-        </w:tc>
-        <w:tc>
-          <w:tcPr>
-            <w:tcW w:type="dxa" w:w="5197"/>
+              <w:t>Case assumption</w:t>
+            </w:r>
+          </w:p>
+        </w:tc>
+        <w:tc>
+          <w:tcPr>
+            <w:tcW w:type="dxa" w:w="5217"/>
           </w:tcPr>
           <w:p>
             <w:pPr>
@@ -8592,13 +10903,13 @@
               <w:rPr>
                 <w:sz w:val="19"/>
               </w:rPr>
-              <w:t>The manager who is responsible for the experience customers have across all channels, and who decides where the company invests in it.</w:t>
-            </w:r>
-          </w:p>
-        </w:tc>
-        <w:tc>
-          <w:tcPr>
-            <w:tcW w:type="dxa" w:w="1356"/>
+              <w:t>A fact made up for this exercise to fill a gap in the plan's case. It is marked so you know it is not part of the plan.</w:t>
+            </w:r>
+          </w:p>
+        </w:tc>
+        <w:tc>
+          <w:tcPr>
+            <w:tcW w:type="dxa" w:w="1349"/>
           </w:tcPr>
           <w:p>
             <w:pPr>
@@ -8635,7 +10946,7 @@
         </w:trPr>
         <w:tc>
           <w:tcPr>
-            <w:tcW w:type="dxa" w:w="2174"/>
+            <w:tcW w:type="dxa" w:w="2161"/>
           </w:tcPr>
           <w:p>
             <w:pPr>
@@ -8646,13 +10957,13 @@
                 <w:b/>
                 <w:sz w:val="19"/>
               </w:rPr>
-              <w:t>Decision architecture</w:t>
-            </w:r>
-          </w:p>
-        </w:tc>
-        <w:tc>
-          <w:tcPr>
-            <w:tcW w:type="dxa" w:w="5197"/>
+              <w:t>Chief Experience Officer</w:t>
+            </w:r>
+          </w:p>
+        </w:tc>
+        <w:tc>
+          <w:tcPr>
+            <w:tcW w:type="dxa" w:w="5217"/>
           </w:tcPr>
           <w:p>
             <w:pPr>
@@ -8662,13 +10973,13 @@
               <w:rPr>
                 <w:sz w:val="19"/>
               </w:rPr>
-              <w:t>A set of connected decisions that are made on purpose and written down: what effect you want, what comes first, who decides and how conflicts are settled. It replaces many separate fixes.</w:t>
-            </w:r>
-          </w:p>
-        </w:tc>
-        <w:tc>
-          <w:tcPr>
-            <w:tcW w:type="dxa" w:w="1356"/>
+              <w:t>The manager who is responsible for the experience customers have across all channels, and who decides where the company invests in it.</w:t>
+            </w:r>
+          </w:p>
+        </w:tc>
+        <w:tc>
+          <w:tcPr>
+            <w:tcW w:type="dxa" w:w="1349"/>
           </w:tcPr>
           <w:p>
             <w:pPr>
@@ -8705,7 +11016,7 @@
         </w:trPr>
         <w:tc>
           <w:tcPr>
-            <w:tcW w:type="dxa" w:w="2174"/>
+            <w:tcW w:type="dxa" w:w="2161"/>
           </w:tcPr>
           <w:p>
             <w:pPr>
@@ -8716,13 +11027,13 @@
                 <w:b/>
                 <w:sz w:val="19"/>
               </w:rPr>
-              <w:t>EEG</w:t>
-            </w:r>
-          </w:p>
-        </w:tc>
-        <w:tc>
-          <w:tcPr>
-            <w:tcW w:type="dxa" w:w="5197"/>
+              <w:t>Decision architecture</w:t>
+            </w:r>
+          </w:p>
+        </w:tc>
+        <w:tc>
+          <w:tcPr>
+            <w:tcW w:type="dxa" w:w="5217"/>
           </w:tcPr>
           <w:p>
             <w:pPr>
@@ -8732,13 +11043,13 @@
               <w:rPr>
                 <w:sz w:val="19"/>
               </w:rPr>
-              <w:t>Measuring the brain's electrical activity through sensors on the scalp; cheap headbands do it roughly and are disturbed by movement and muscles.</w:t>
-            </w:r>
-          </w:p>
-        </w:tc>
-        <w:tc>
-          <w:tcPr>
-            <w:tcW w:type="dxa" w:w="1356"/>
+              <w:t>A set of connected decisions that are made on purpose and written down: what effect you want, what comes first, who decides and how conflicts are settled. It replaces many separate fixes.</w:t>
+            </w:r>
+          </w:p>
+        </w:tc>
+        <w:tc>
+          <w:tcPr>
+            <w:tcW w:type="dxa" w:w="1349"/>
           </w:tcPr>
           <w:p>
             <w:pPr>
@@ -8764,7 +11075,7 @@
               <w:rPr>
                 <w:sz w:val="19"/>
               </w:rPr>
-              <w:t>Day 15</w:t>
+              <w:t>Day 1</w:t>
             </w:r>
           </w:p>
         </w:tc>
@@ -8775,7 +11086,7 @@
         </w:trPr>
         <w:tc>
           <w:tcPr>
-            <w:tcW w:type="dxa" w:w="2174"/>
+            <w:tcW w:type="dxa" w:w="2161"/>
           </w:tcPr>
           <w:p>
             <w:pPr>
@@ -8786,13 +11097,13 @@
                 <w:b/>
                 <w:sz w:val="19"/>
               </w:rPr>
-              <w:t>Evidence grade</w:t>
-            </w:r>
-          </w:p>
-        </w:tc>
-        <w:tc>
-          <w:tcPr>
-            <w:tcW w:type="dxa" w:w="5197"/>
+              <w:t>EEG</w:t>
+            </w:r>
+          </w:p>
+        </w:tc>
+        <w:tc>
+          <w:tcPr>
+            <w:tcW w:type="dxa" w:w="5217"/>
           </w:tcPr>
           <w:p>
             <w:pPr>
@@ -8802,13 +11113,13 @@
               <w:rPr>
                 <w:sz w:val="19"/>
               </w:rPr>
-              <w:t>A label for how sure a finding is, from a first hint to a result that held up again, so that only robust findings drive decisions.</w:t>
-            </w:r>
-          </w:p>
-        </w:tc>
-        <w:tc>
-          <w:tcPr>
-            <w:tcW w:type="dxa" w:w="1356"/>
+              <w:t>Measuring the brain's electrical activity through sensors on the scalp; cheap headbands do it roughly and are disturbed by movement and muscles.</w:t>
+            </w:r>
+          </w:p>
+        </w:tc>
+        <w:tc>
+          <w:tcPr>
+            <w:tcW w:type="dxa" w:w="1349"/>
           </w:tcPr>
           <w:p>
             <w:pPr>
@@ -8845,7 +11156,7 @@
         </w:trPr>
         <w:tc>
           <w:tcPr>
-            <w:tcW w:type="dxa" w:w="2174"/>
+            <w:tcW w:type="dxa" w:w="2161"/>
           </w:tcPr>
           <w:p>
             <w:pPr>
@@ -8856,13 +11167,13 @@
                 <w:b/>
                 <w:sz w:val="19"/>
               </w:rPr>
-              <w:t>Eye-tracking</w:t>
-            </w:r>
-          </w:p>
-        </w:tc>
-        <w:tc>
-          <w:tcPr>
-            <w:tcW w:type="dxa" w:w="5197"/>
+              <w:t>Evidence grade</w:t>
+            </w:r>
+          </w:p>
+        </w:tc>
+        <w:tc>
+          <w:tcPr>
+            <w:tcW w:type="dxa" w:w="5217"/>
           </w:tcPr>
           <w:p>
             <w:pPr>
@@ -8872,13 +11183,13 @@
               <w:rPr>
                 <w:sz w:val="19"/>
               </w:rPr>
-              <w:t>Measuring where a person looks, usually with infrared light and a camera, and recording it so it can be replayed and analysed.</w:t>
-            </w:r>
-          </w:p>
-        </w:tc>
-        <w:tc>
-          <w:tcPr>
-            <w:tcW w:type="dxa" w:w="1356"/>
+              <w:t>A label for how sure a finding is, from a first hint to a result that held up again, so that only robust findings drive decisions.</w:t>
+            </w:r>
+          </w:p>
+        </w:tc>
+        <w:tc>
+          <w:tcPr>
+            <w:tcW w:type="dxa" w:w="1349"/>
           </w:tcPr>
           <w:p>
             <w:pPr>
@@ -8915,7 +11226,7 @@
         </w:trPr>
         <w:tc>
           <w:tcPr>
-            <w:tcW w:type="dxa" w:w="2174"/>
+            <w:tcW w:type="dxa" w:w="2161"/>
           </w:tcPr>
           <w:p>
             <w:pPr>
@@ -8926,13 +11237,13 @@
                 <w:b/>
                 <w:sz w:val="19"/>
               </w:rPr>
-              <w:t>Fixation</w:t>
-            </w:r>
-          </w:p>
-        </w:tc>
-        <w:tc>
-          <w:tcPr>
-            <w:tcW w:type="dxa" w:w="5197"/>
+              <w:t>Eye-tracking</w:t>
+            </w:r>
+          </w:p>
+        </w:tc>
+        <w:tc>
+          <w:tcPr>
+            <w:tcW w:type="dxa" w:w="5217"/>
           </w:tcPr>
           <w:p>
             <w:pPr>
@@ -8942,13 +11253,13 @@
               <w:rPr>
                 <w:sz w:val="19"/>
               </w:rPr>
-              <w:t>A short pause of the eye on one spot, usually a fraction of a second; most of what we take in, we take in during fixations.</w:t>
-            </w:r>
-          </w:p>
-        </w:tc>
-        <w:tc>
-          <w:tcPr>
-            <w:tcW w:type="dxa" w:w="1356"/>
+              <w:t>Measuring where a person looks, usually with infrared light and a camera, and recording it so it can be replayed and analysed.</w:t>
+            </w:r>
+          </w:p>
+        </w:tc>
+        <w:tc>
+          <w:tcPr>
+            <w:tcW w:type="dxa" w:w="1349"/>
           </w:tcPr>
           <w:p>
             <w:pPr>
@@ -8985,7 +11296,7 @@
         </w:trPr>
         <w:tc>
           <w:tcPr>
-            <w:tcW w:type="dxa" w:w="2174"/>
+            <w:tcW w:type="dxa" w:w="2161"/>
           </w:tcPr>
           <w:p>
             <w:pPr>
@@ -8996,13 +11307,13 @@
                 <w:b/>
                 <w:sz w:val="19"/>
               </w:rPr>
-              <w:t>Governance</w:t>
-            </w:r>
-          </w:p>
-        </w:tc>
-        <w:tc>
-          <w:tcPr>
-            <w:tcW w:type="dxa" w:w="5197"/>
+              <w:t>Fixation</w:t>
+            </w:r>
+          </w:p>
+        </w:tc>
+        <w:tc>
+          <w:tcPr>
+            <w:tcW w:type="dxa" w:w="5217"/>
           </w:tcPr>
           <w:p>
             <w:pPr>
@@ -9012,13 +11323,13 @@
               <w:rPr>
                 <w:sz w:val="19"/>
               </w:rPr>
-              <w:t>The rules about who may decide what, who is answerable for it and how disagreements are settled.</w:t>
-            </w:r>
-          </w:p>
-        </w:tc>
-        <w:tc>
-          <w:tcPr>
-            <w:tcW w:type="dxa" w:w="1356"/>
+              <w:t>A short pause of the eye on one spot, usually a fraction of a second; most of what we take in, we take in during fixations.</w:t>
+            </w:r>
+          </w:p>
+        </w:tc>
+        <w:tc>
+          <w:tcPr>
+            <w:tcW w:type="dxa" w:w="1349"/>
           </w:tcPr>
           <w:p>
             <w:pPr>
@@ -9044,7 +11355,7 @@
               <w:rPr>
                 <w:sz w:val="19"/>
               </w:rPr>
-              <w:t>Day 1</w:t>
+              <w:t>Day 15</w:t>
             </w:r>
           </w:p>
         </w:tc>
@@ -9055,7 +11366,7 @@
         </w:trPr>
         <w:tc>
           <w:tcPr>
-            <w:tcW w:type="dxa" w:w="2174"/>
+            <w:tcW w:type="dxa" w:w="2161"/>
           </w:tcPr>
           <w:p>
             <w:pPr>
@@ -9066,13 +11377,13 @@
                 <w:b/>
                 <w:sz w:val="19"/>
               </w:rPr>
-              <w:t>Heatmap</w:t>
-            </w:r>
-          </w:p>
-        </w:tc>
-        <w:tc>
-          <w:tcPr>
-            <w:tcW w:type="dxa" w:w="5197"/>
+              <w:t>Governance</w:t>
+            </w:r>
+          </w:p>
+        </w:tc>
+        <w:tc>
+          <w:tcPr>
+            <w:tcW w:type="dxa" w:w="5217"/>
           </w:tcPr>
           <w:p>
             <w:pPr>
@@ -9082,13 +11393,13 @@
               <w:rPr>
                 <w:sz w:val="19"/>
               </w:rPr>
-              <w:t>A picture that colours a page by how long or how often people looked at each part, added up over people; it loses the order and the individual.</w:t>
-            </w:r>
-          </w:p>
-        </w:tc>
-        <w:tc>
-          <w:tcPr>
-            <w:tcW w:type="dxa" w:w="1356"/>
+              <w:t>The rules about who may decide what, who is answerable for it and how disagreements are settled.</w:t>
+            </w:r>
+          </w:p>
+        </w:tc>
+        <w:tc>
+          <w:tcPr>
+            <w:tcW w:type="dxa" w:w="1349"/>
           </w:tcPr>
           <w:p>
             <w:pPr>
@@ -9114,7 +11425,7 @@
               <w:rPr>
                 <w:sz w:val="19"/>
               </w:rPr>
-              <w:t>Day 15</w:t>
+              <w:t>Day 1</w:t>
             </w:r>
           </w:p>
         </w:tc>
@@ -9125,7 +11436,7 @@
         </w:trPr>
         <w:tc>
           <w:tcPr>
-            <w:tcW w:type="dxa" w:w="2174"/>
+            <w:tcW w:type="dxa" w:w="2161"/>
           </w:tcPr>
           <w:p>
             <w:pPr>
@@ -9136,13 +11447,13 @@
                 <w:b/>
                 <w:sz w:val="19"/>
               </w:rPr>
-              <w:t>Hypothesis</w:t>
-            </w:r>
-          </w:p>
-        </w:tc>
-        <w:tc>
-          <w:tcPr>
-            <w:tcW w:type="dxa" w:w="5197"/>
+              <w:t>Heatmap</w:t>
+            </w:r>
+          </w:p>
+        </w:tc>
+        <w:tc>
+          <w:tcPr>
+            <w:tcW w:type="dxa" w:w="5217"/>
           </w:tcPr>
           <w:p>
             <w:pPr>
@@ -9152,13 +11463,13 @@
               <w:rPr>
                 <w:sz w:val="19"/>
               </w:rPr>
-              <w:t>An assumption you could check later. “This red banner could make users uneasy” is a hypothesis; “this banner is bad” is only an opinion.</w:t>
-            </w:r>
-          </w:p>
-        </w:tc>
-        <w:tc>
-          <w:tcPr>
-            <w:tcW w:type="dxa" w:w="1356"/>
+              <w:t>A picture that colours a page by how long or how often people looked at each part, added up over people; it loses the order and the individual.</w:t>
+            </w:r>
+          </w:p>
+        </w:tc>
+        <w:tc>
+          <w:tcPr>
+            <w:tcW w:type="dxa" w:w="1349"/>
           </w:tcPr>
           <w:p>
             <w:pPr>
@@ -9184,7 +11495,7 @@
               <w:rPr>
                 <w:sz w:val="19"/>
               </w:rPr>
-              <w:t>Day 1</w:t>
+              <w:t>Day 15</w:t>
             </w:r>
           </w:p>
         </w:tc>
@@ -9195,7 +11506,7 @@
         </w:trPr>
         <w:tc>
           <w:tcPr>
-            <w:tcW w:type="dxa" w:w="2174"/>
+            <w:tcW w:type="dxa" w:w="2161"/>
           </w:tcPr>
           <w:p>
             <w:pPr>
@@ -9206,13 +11517,13 @@
                 <w:b/>
                 <w:sz w:val="19"/>
               </w:rPr>
-              <w:t>Information architecture</w:t>
-            </w:r>
-          </w:p>
-        </w:tc>
-        <w:tc>
-          <w:tcPr>
-            <w:tcW w:type="dxa" w:w="5197"/>
+              <w:t>Hypothesis</w:t>
+            </w:r>
+          </w:p>
+        </w:tc>
+        <w:tc>
+          <w:tcPr>
+            <w:tcW w:type="dxa" w:w="5217"/>
           </w:tcPr>
           <w:p>
             <w:pPr>
@@ -9222,13 +11533,13 @@
               <w:rPr>
                 <w:sz w:val="19"/>
               </w:rPr>
-              <w:t>How the content of a website or app is organised, grouped and named, and how people move through it. It is the structure behind the screens.</w:t>
-            </w:r>
-          </w:p>
-        </w:tc>
-        <w:tc>
-          <w:tcPr>
-            <w:tcW w:type="dxa" w:w="1356"/>
+              <w:t>An assumption you could check later. “This red banner could make users uneasy” is a hypothesis; “this banner is bad” is only an opinion.</w:t>
+            </w:r>
+          </w:p>
+        </w:tc>
+        <w:tc>
+          <w:tcPr>
+            <w:tcW w:type="dxa" w:w="1349"/>
           </w:tcPr>
           <w:p>
             <w:pPr>
@@ -9254,7 +11565,7 @@
               <w:rPr>
                 <w:sz w:val="19"/>
               </w:rPr>
-              <w:t>Day 2</w:t>
+              <w:t>Day 1</w:t>
             </w:r>
           </w:p>
         </w:tc>
@@ -9265,7 +11576,7 @@
         </w:trPr>
         <w:tc>
           <w:tcPr>
-            <w:tcW w:type="dxa" w:w="2174"/>
+            <w:tcW w:type="dxa" w:w="2161"/>
           </w:tcPr>
           <w:p>
             <w:pPr>
@@ -9276,13 +11587,13 @@
                 <w:b/>
                 <w:sz w:val="19"/>
               </w:rPr>
-              <w:t>Maturity</w:t>
-            </w:r>
-          </w:p>
-        </w:tc>
-        <w:tc>
-          <w:tcPr>
-            <w:tcW w:type="dxa" w:w="5197"/>
+              <w:t>Information architecture</w:t>
+            </w:r>
+          </w:p>
+        </w:tc>
+        <w:tc>
+          <w:tcPr>
+            <w:tcW w:type="dxa" w:w="5217"/>
           </w:tcPr>
           <w:p>
             <w:pPr>
@@ -9292,13 +11603,13 @@
               <w:rPr>
                 <w:sz w:val="19"/>
               </w:rPr>
-              <w:t>How far a technology is from an idea to reliable use: does it work, in the real environment, for real users, at scale?</w:t>
-            </w:r>
-          </w:p>
-        </w:tc>
-        <w:tc>
-          <w:tcPr>
-            <w:tcW w:type="dxa" w:w="1356"/>
+              <w:t>How the content of a website or app is organised, grouped and named, and how people move through it. It is the structure behind the screens.</w:t>
+            </w:r>
+          </w:p>
+        </w:tc>
+        <w:tc>
+          <w:tcPr>
+            <w:tcW w:type="dxa" w:w="1349"/>
           </w:tcPr>
           <w:p>
             <w:pPr>
@@ -9324,7 +11635,7 @@
               <w:rPr>
                 <w:sz w:val="19"/>
               </w:rPr>
-              <w:t>Day 14</w:t>
+              <w:t>Day 2</w:t>
             </w:r>
           </w:p>
         </w:tc>
@@ -9335,7 +11646,7 @@
         </w:trPr>
         <w:tc>
           <w:tcPr>
-            <w:tcW w:type="dxa" w:w="2174"/>
+            <w:tcW w:type="dxa" w:w="2161"/>
           </w:tcPr>
           <w:p>
             <w:pPr>
@@ -9346,13 +11657,13 @@
                 <w:b/>
                 <w:sz w:val="19"/>
               </w:rPr>
-              <w:t>Neuro-UX</w:t>
-            </w:r>
-          </w:p>
-        </w:tc>
-        <w:tc>
-          <w:tcPr>
-            <w:tcW w:type="dxa" w:w="5197"/>
+              <w:t>Maturity</w:t>
+            </w:r>
+          </w:p>
+        </w:tc>
+        <w:tc>
+          <w:tcPr>
+            <w:tcW w:type="dxa" w:w="5217"/>
           </w:tcPr>
           <w:p>
             <w:pPr>
@@ -9362,13 +11673,13 @@
               <w:rPr>
                 <w:sz w:val="19"/>
               </w:rPr>
-              <w:t>Designing an interface with knowledge of how the brain sees, attends, feels and decides, so that the design steers these processes on purpose and responsibly.</w:t>
-            </w:r>
-          </w:p>
-        </w:tc>
-        <w:tc>
-          <w:tcPr>
-            <w:tcW w:type="dxa" w:w="1356"/>
+              <w:t>How far a technology is from an idea to reliable use: does it work, in the real environment, for real users, at scale?</w:t>
+            </w:r>
+          </w:p>
+        </w:tc>
+        <w:tc>
+          <w:tcPr>
+            <w:tcW w:type="dxa" w:w="1349"/>
           </w:tcPr>
           <w:p>
             <w:pPr>
@@ -9394,7 +11705,7 @@
               <w:rPr>
                 <w:sz w:val="19"/>
               </w:rPr>
-              <w:t>Day 1</w:t>
+              <w:t>Day 14</w:t>
             </w:r>
           </w:p>
         </w:tc>
@@ -9405,7 +11716,7 @@
         </w:trPr>
         <w:tc>
           <w:tcPr>
-            <w:tcW w:type="dxa" w:w="2174"/>
+            <w:tcW w:type="dxa" w:w="2161"/>
           </w:tcPr>
           <w:p>
             <w:pPr>
@@ -9416,13 +11727,13 @@
                 <w:b/>
                 <w:sz w:val="19"/>
               </w:rPr>
-              <w:t>Neurodata</w:t>
-            </w:r>
-          </w:p>
-        </w:tc>
-        <w:tc>
-          <w:tcPr>
-            <w:tcW w:type="dxa" w:w="5197"/>
+              <w:t>Neuro-UX</w:t>
+            </w:r>
+          </w:p>
+        </w:tc>
+        <w:tc>
+          <w:tcPr>
+            <w:tcW w:type="dxa" w:w="5217"/>
           </w:tcPr>
           <w:p>
             <w:pPr>
@@ -9432,13 +11743,13 @@
               <w:rPr>
                 <w:sz w:val="19"/>
               </w:rPr>
-              <w:t>Information produced directly by the brain and nervous system; regulators treat it as high-risk personal data.</w:t>
-            </w:r>
-          </w:p>
-        </w:tc>
-        <w:tc>
-          <w:tcPr>
-            <w:tcW w:type="dxa" w:w="1356"/>
+              <w:t>Designing an interface with knowledge of how the brain sees, attends, feels and decides, so that the design steers these processes on purpose and responsibly.</w:t>
+            </w:r>
+          </w:p>
+        </w:tc>
+        <w:tc>
+          <w:tcPr>
+            <w:tcW w:type="dxa" w:w="1349"/>
           </w:tcPr>
           <w:p>
             <w:pPr>
@@ -9464,7 +11775,7 @@
               <w:rPr>
                 <w:sz w:val="19"/>
               </w:rPr>
-              <w:t>Day 15</w:t>
+              <w:t>Day 1</w:t>
             </w:r>
           </w:p>
         </w:tc>
@@ -9475,7 +11786,7 @@
         </w:trPr>
         <w:tc>
           <w:tcPr>
-            <w:tcW w:type="dxa" w:w="2174"/>
+            <w:tcW w:type="dxa" w:w="2161"/>
           </w:tcPr>
           <w:p>
             <w:pPr>
@@ -9486,13 +11797,13 @@
                 <w:b/>
                 <w:sz w:val="19"/>
               </w:rPr>
-              <w:t>Neurofeedback</w:t>
-            </w:r>
-          </w:p>
-        </w:tc>
-        <w:tc>
-          <w:tcPr>
-            <w:tcW w:type="dxa" w:w="5197"/>
+              <w:t>Neurodata</w:t>
+            </w:r>
+          </w:p>
+        </w:tc>
+        <w:tc>
+          <w:tcPr>
+            <w:tcW w:type="dxa" w:w="5217"/>
           </w:tcPr>
           <w:p>
             <w:pPr>
@@ -9502,13 +11813,13 @@
               <w:rPr>
                 <w:sz w:val="19"/>
               </w:rPr>
-              <w:t>Showing people a signal of their own brain activity, usually from EEG, so they can learn to change it; used in therapy and research, with mixed evidence.</w:t>
-            </w:r>
-          </w:p>
-        </w:tc>
-        <w:tc>
-          <w:tcPr>
-            <w:tcW w:type="dxa" w:w="1356"/>
+              <w:t>Information produced directly by the brain and nervous system; regulators treat it as high-risk personal data.</w:t>
+            </w:r>
+          </w:p>
+        </w:tc>
+        <w:tc>
+          <w:tcPr>
+            <w:tcW w:type="dxa" w:w="1349"/>
           </w:tcPr>
           <w:p>
             <w:pPr>
@@ -9545,7 +11856,7 @@
         </w:trPr>
         <w:tc>
           <w:tcPr>
-            <w:tcW w:type="dxa" w:w="2174"/>
+            <w:tcW w:type="dxa" w:w="2161"/>
           </w:tcPr>
           <w:p>
             <w:pPr>
@@ -9556,13 +11867,13 @@
                 <w:b/>
                 <w:sz w:val="19"/>
               </w:rPr>
-              <w:t>Personalisation</w:t>
-            </w:r>
-          </w:p>
-        </w:tc>
-        <w:tc>
-          <w:tcPr>
-            <w:tcW w:type="dxa" w:w="5197"/>
+              <w:t>Neurofeedback</w:t>
+            </w:r>
+          </w:p>
+        </w:tc>
+        <w:tc>
+          <w:tcPr>
+            <w:tcW w:type="dxa" w:w="5217"/>
           </w:tcPr>
           <w:p>
             <w:pPr>
@@ -9572,13 +11883,13 @@
               <w:rPr>
                 <w:sz w:val="19"/>
               </w:rPr>
-              <w:t>Changing what someone sees from what is known about them: their history, their preferences, their profile.</w:t>
-            </w:r>
-          </w:p>
-        </w:tc>
-        <w:tc>
-          <w:tcPr>
-            <w:tcW w:type="dxa" w:w="1356"/>
+              <w:t>Showing people a signal of their own brain activity, usually from EEG, so they can learn to change it; used in therapy and research, with mixed evidence.</w:t>
+            </w:r>
+          </w:p>
+        </w:tc>
+        <w:tc>
+          <w:tcPr>
+            <w:tcW w:type="dxa" w:w="1349"/>
           </w:tcPr>
           <w:p>
             <w:pPr>
@@ -9604,7 +11915,7 @@
               <w:rPr>
                 <w:sz w:val="19"/>
               </w:rPr>
-              <w:t>Day 10</w:t>
+              <w:t>Day 15</w:t>
             </w:r>
           </w:p>
         </w:tc>
@@ -9615,7 +11926,7 @@
         </w:trPr>
         <w:tc>
           <w:tcPr>
-            <w:tcW w:type="dxa" w:w="2174"/>
+            <w:tcW w:type="dxa" w:w="2161"/>
           </w:tcPr>
           <w:p>
             <w:pPr>
@@ -9626,13 +11937,13 @@
                 <w:b/>
                 <w:sz w:val="19"/>
               </w:rPr>
-              <w:t>Ranking (leaderboard)</w:t>
-            </w:r>
-          </w:p>
-        </w:tc>
-        <w:tc>
-          <w:tcPr>
-            <w:tcW w:type="dxa" w:w="5197"/>
+              <w:t>Personalisation</w:t>
+            </w:r>
+          </w:p>
+        </w:tc>
+        <w:tc>
+          <w:tcPr>
+            <w:tcW w:type="dxa" w:w="5217"/>
           </w:tcPr>
           <w:p>
             <w:pPr>
@@ -9642,13 +11953,13 @@
               <w:rPr>
                 <w:sz w:val="19"/>
               </w:rPr>
-              <w:t>A list that orders people by points or results; it motivates those near the top and can shame those near the bottom.</w:t>
-            </w:r>
-          </w:p>
-        </w:tc>
-        <w:tc>
-          <w:tcPr>
-            <w:tcW w:type="dxa" w:w="1356"/>
+              <w:t>Changing what someone sees from what is known about them: their history, their preferences, their profile.</w:t>
+            </w:r>
+          </w:p>
+        </w:tc>
+        <w:tc>
+          <w:tcPr>
+            <w:tcW w:type="dxa" w:w="1349"/>
           </w:tcPr>
           <w:p>
             <w:pPr>
@@ -9674,7 +11985,7 @@
               <w:rPr>
                 <w:sz w:val="19"/>
               </w:rPr>
-              <w:t>Day 9</w:t>
+              <w:t>Day 10</w:t>
             </w:r>
           </w:p>
         </w:tc>
@@ -9685,7 +11996,7 @@
         </w:trPr>
         <w:tc>
           <w:tcPr>
-            <w:tcW w:type="dxa" w:w="2174"/>
+            <w:tcW w:type="dxa" w:w="2161"/>
           </w:tcPr>
           <w:p>
             <w:pPr>
@@ -9696,13 +12007,13 @@
                 <w:b/>
                 <w:sz w:val="19"/>
               </w:rPr>
-              <w:t>Retrospective think-aloud</w:t>
-            </w:r>
-          </w:p>
-        </w:tc>
-        <w:tc>
-          <w:tcPr>
-            <w:tcW w:type="dxa" w:w="5197"/>
+              <w:t>Ranking (leaderboard)</w:t>
+            </w:r>
+          </w:p>
+        </w:tc>
+        <w:tc>
+          <w:tcPr>
+            <w:tcW w:type="dxa" w:w="5217"/>
           </w:tcPr>
           <w:p>
             <w:pPr>
@@ -9712,13 +12023,13 @@
               <w:rPr>
                 <w:sz w:val="19"/>
               </w:rPr>
-              <w:t>Showing people their own recording after a test and asking them to say what they were thinking; it adds the why that the gaze cannot give.</w:t>
-            </w:r>
-          </w:p>
-        </w:tc>
-        <w:tc>
-          <w:tcPr>
-            <w:tcW w:type="dxa" w:w="1356"/>
+              <w:t>A list that orders people by points or results; it motivates those near the top and can shame those near the bottom.</w:t>
+            </w:r>
+          </w:p>
+        </w:tc>
+        <w:tc>
+          <w:tcPr>
+            <w:tcW w:type="dxa" w:w="1349"/>
           </w:tcPr>
           <w:p>
             <w:pPr>
@@ -9744,7 +12055,7 @@
               <w:rPr>
                 <w:sz w:val="19"/>
               </w:rPr>
-              <w:t>Day 15</w:t>
+              <w:t>Day 9</w:t>
             </w:r>
           </w:p>
         </w:tc>
@@ -9755,7 +12066,7 @@
         </w:trPr>
         <w:tc>
           <w:tcPr>
-            <w:tcW w:type="dxa" w:w="2174"/>
+            <w:tcW w:type="dxa" w:w="2161"/>
           </w:tcPr>
           <w:p>
             <w:pPr>
@@ -9766,13 +12077,13 @@
                 <w:b/>
                 <w:sz w:val="19"/>
               </w:rPr>
-              <w:t>Saccade</w:t>
-            </w:r>
-          </w:p>
-        </w:tc>
-        <w:tc>
-          <w:tcPr>
-            <w:tcW w:type="dxa" w:w="5197"/>
+              <w:t>Retrospective think-aloud</w:t>
+            </w:r>
+          </w:p>
+        </w:tc>
+        <w:tc>
+          <w:tcPr>
+            <w:tcW w:type="dxa" w:w="5217"/>
           </w:tcPr>
           <w:p>
             <w:pPr>
@@ -9782,13 +12093,13 @@
               <w:rPr>
                 <w:sz w:val="19"/>
               </w:rPr>
-              <w:t>The fast jump of the eye from one fixation to the next; during it, we hardly see anything.</w:t>
-            </w:r>
-          </w:p>
-        </w:tc>
-        <w:tc>
-          <w:tcPr>
-            <w:tcW w:type="dxa" w:w="1356"/>
+              <w:t>Showing people their own recording after a test and asking them to say what they were thinking; it adds the why that the gaze cannot give.</w:t>
+            </w:r>
+          </w:p>
+        </w:tc>
+        <w:tc>
+          <w:tcPr>
+            <w:tcW w:type="dxa" w:w="1349"/>
           </w:tcPr>
           <w:p>
             <w:pPr>
@@ -9825,7 +12136,7 @@
         </w:trPr>
         <w:tc>
           <w:tcPr>
-            <w:tcW w:type="dxa" w:w="2174"/>
+            <w:tcW w:type="dxa" w:w="2161"/>
           </w:tcPr>
           <w:p>
             <w:pPr>
@@ -9836,13 +12147,13 @@
                 <w:b/>
                 <w:sz w:val="19"/>
               </w:rPr>
-              <w:t>Scanpath</w:t>
-            </w:r>
-          </w:p>
-        </w:tc>
-        <w:tc>
-          <w:tcPr>
-            <w:tcW w:type="dxa" w:w="5197"/>
+              <w:t>Saccade</w:t>
+            </w:r>
+          </w:p>
+        </w:tc>
+        <w:tc>
+          <w:tcPr>
+            <w:tcW w:type="dxa" w:w="5217"/>
           </w:tcPr>
           <w:p>
             <w:pPr>
@@ -9852,13 +12163,13 @@
               <w:rPr>
                 <w:sz w:val="19"/>
               </w:rPr>
-              <w:t>The order of fixations and jumps across a page: where someone looked first, next and last.</w:t>
-            </w:r>
-          </w:p>
-        </w:tc>
-        <w:tc>
-          <w:tcPr>
-            <w:tcW w:type="dxa" w:w="1356"/>
+              <w:t>The fast jump of the eye from one fixation to the next; during it, we hardly see anything.</w:t>
+            </w:r>
+          </w:p>
+        </w:tc>
+        <w:tc>
+          <w:tcPr>
+            <w:tcW w:type="dxa" w:w="1349"/>
           </w:tcPr>
           <w:p>
             <w:pPr>
@@ -9895,7 +12206,7 @@
         </w:trPr>
         <w:tc>
           <w:tcPr>
-            <w:tcW w:type="dxa" w:w="2174"/>
+            <w:tcW w:type="dxa" w:w="2161"/>
           </w:tcPr>
           <w:p>
             <w:pPr>
@@ -9906,13 +12217,13 @@
                 <w:b/>
                 <w:sz w:val="19"/>
               </w:rPr>
-              <w:t>UX (user experience)</w:t>
-            </w:r>
-          </w:p>
-        </w:tc>
-        <w:tc>
-          <w:tcPr>
-            <w:tcW w:type="dxa" w:w="5197"/>
+              <w:t>Scanpath</w:t>
+            </w:r>
+          </w:p>
+        </w:tc>
+        <w:tc>
+          <w:tcPr>
+            <w:tcW w:type="dxa" w:w="5217"/>
           </w:tcPr>
           <w:p>
             <w:pPr>
@@ -9922,13 +12233,13 @@
               <w:rPr>
                 <w:sz w:val="19"/>
               </w:rPr>
-              <w:t>Everything a person goes through when using a product: what they notice, understand, feel and do, from the first look to the last step. The screens are only one part of it.</w:t>
-            </w:r>
-          </w:p>
-        </w:tc>
-        <w:tc>
-          <w:tcPr>
-            <w:tcW w:type="dxa" w:w="1356"/>
+              <w:t>The order of fixations and jumps across a page: where someone looked first, next and last.</w:t>
+            </w:r>
+          </w:p>
+        </w:tc>
+        <w:tc>
+          <w:tcPr>
+            <w:tcW w:type="dxa" w:w="1349"/>
           </w:tcPr>
           <w:p>
             <w:pPr>
@@ -9938,7 +12249,7 @@
               <w:rPr>
                 <w:sz w:val="19"/>
               </w:rPr>
-              <w:t>Finding the booking you want at once and feeling sure it went through is a good UX.</w:t>
+              <w:t>—</w:t>
             </w:r>
           </w:p>
         </w:tc>
@@ -9954,7 +12265,7 @@
               <w:rPr>
                 <w:sz w:val="19"/>
               </w:rPr>
-              <w:t>Day 1</w:t>
+              <w:t>Day 15</w:t>
             </w:r>
           </w:p>
         </w:tc>
@@ -9965,7 +12276,7 @@
         </w:trPr>
         <w:tc>
           <w:tcPr>
-            <w:tcW w:type="dxa" w:w="2174"/>
+            <w:tcW w:type="dxa" w:w="2161"/>
           </w:tcPr>
           <w:p>
             <w:pPr>
@@ -9976,13 +12287,13 @@
                 <w:b/>
                 <w:sz w:val="19"/>
               </w:rPr>
-              <w:t>Validity</w:t>
-            </w:r>
-          </w:p>
-        </w:tc>
-        <w:tc>
-          <w:tcPr>
-            <w:tcW w:type="dxa" w:w="5197"/>
+              <w:t>UX (user experience)</w:t>
+            </w:r>
+          </w:p>
+        </w:tc>
+        <w:tc>
+          <w:tcPr>
+            <w:tcW w:type="dxa" w:w="5217"/>
           </w:tcPr>
           <w:p>
             <w:pPr>
@@ -9992,13 +12303,13 @@
               <w:rPr>
                 <w:sz w:val="19"/>
               </w:rPr>
-              <w:t>Whether a measure really measures what it claims to, for example whether a “concentration score” shows concentration and not just movement.</w:t>
-            </w:r>
-          </w:p>
-        </w:tc>
-        <w:tc>
-          <w:tcPr>
-            <w:tcW w:type="dxa" w:w="1356"/>
+              <w:t>Everything a person goes through when using a product: what they notice, understand, feel and do, from the first look to the last step. The screens are only one part of it.</w:t>
+            </w:r>
+          </w:p>
+        </w:tc>
+        <w:tc>
+          <w:tcPr>
+            <w:tcW w:type="dxa" w:w="1349"/>
           </w:tcPr>
           <w:p>
             <w:pPr>
@@ -10008,7 +12319,7 @@
               <w:rPr>
                 <w:sz w:val="19"/>
               </w:rPr>
-              <w:t>—</w:t>
+              <w:t>Finding the booking you want at once and feeling sure it went through is a good UX.</w:t>
             </w:r>
           </w:p>
         </w:tc>
@@ -10024,7 +12335,7 @@
               <w:rPr>
                 <w:sz w:val="19"/>
               </w:rPr>
-              <w:t>Day 15</w:t>
+              <w:t>Day 1</w:t>
             </w:r>
           </w:p>
         </w:tc>
@@ -10035,7 +12346,7 @@
         </w:trPr>
         <w:tc>
           <w:tcPr>
-            <w:tcW w:type="dxa" w:w="2174"/>
+            <w:tcW w:type="dxa" w:w="2161"/>
           </w:tcPr>
           <w:p>
             <w:pPr>
@@ -10046,13 +12357,83 @@
                 <w:b/>
                 <w:sz w:val="19"/>
               </w:rPr>
+              <w:t>Validity</w:t>
+            </w:r>
+          </w:p>
+        </w:tc>
+        <w:tc>
+          <w:tcPr>
+            <w:tcW w:type="dxa" w:w="5217"/>
+          </w:tcPr>
+          <w:p>
+            <w:pPr>
+              <w:spacing w:before="0" w:after="0"/>
+            </w:pPr>
+            <w:r>
+              <w:rPr>
+                <w:sz w:val="19"/>
+              </w:rPr>
+              <w:t>Whether a measure really measures what it claims to, for example whether a “concentration score” shows concentration and not just movement.</w:t>
+            </w:r>
+          </w:p>
+        </w:tc>
+        <w:tc>
+          <w:tcPr>
+            <w:tcW w:type="dxa" w:w="1349"/>
+          </w:tcPr>
+          <w:p>
+            <w:pPr>
+              <w:spacing w:before="0" w:after="0"/>
+            </w:pPr>
+            <w:r>
+              <w:rPr>
+                <w:sz w:val="19"/>
+              </w:rPr>
+              <w:t>—</w:t>
+            </w:r>
+          </w:p>
+        </w:tc>
+        <w:tc>
+          <w:tcPr>
+            <w:tcW w:type="dxa" w:w="911"/>
+          </w:tcPr>
+          <w:p>
+            <w:pPr>
+              <w:spacing w:before="0" w:after="0"/>
+            </w:pPr>
+            <w:r>
+              <w:rPr>
+                <w:sz w:val="19"/>
+              </w:rPr>
+              <w:t>Day 15</w:t>
+            </w:r>
+          </w:p>
+        </w:tc>
+      </w:tr>
+      <w:tr>
+        <w:trPr>
+          <w:cantSplit/>
+        </w:trPr>
+        <w:tc>
+          <w:tcPr>
+            <w:tcW w:type="dxa" w:w="2161"/>
+          </w:tcPr>
+          <w:p>
+            <w:pPr>
+              <w:spacing w:before="0" w:after="0"/>
+            </w:pPr>
+            <w:r>
+              <w:rPr>
+                <w:b/>
+                <w:sz w:val="19"/>
+              </w:rPr>
               <w:t>Visual hierarchy</w:t>
             </w:r>
           </w:p>
         </w:tc>
         <w:tc>
           <w:tcPr>
-            <w:tcW w:type="dxa" w:w="5197"/>
+            <w:tcW w:type="dxa" w:w="5217"/>
           </w:tcPr>
           <w:p>
             <w:pPr>
@@ -10068,7 +12449,7 @@
         </w:tc>
         <w:tc>
           <w:tcPr>
-            <w:tcW w:type="dxa" w:w="1356"/>
+            <w:tcW w:type="dxa" w:w="1349"/>
           </w:tcPr>
           <w:p>
             <w:pPr>

</xml_diff>